<commit_message>
Sync production portal source
</commit_message>
<xml_diff>
--- a/Letter_of_Confirmation(environment).docx
+++ b/Letter_of_Confirmation(environment).docx
@@ -1470,7 +1470,8 @@
       <w:tblPr>
         <w:tblpPr w:leftFromText="142" w:rightFromText="142" w:vertAnchor="text" w:horzAnchor="margin" w:tblpY="437"/>
         <w:tblOverlap w:val="never"/>
-        <w:tblW w:w="9773" w:type="dxa"/>
+        <w:tblW w:w="10487" w:type="dxa"/>
+        <w:tblLayout w:type="fixed"/>
         <w:tblCellMar>
           <w:top w:w="15" w:type="dxa"/>
           <w:left w:w="15" w:type="dxa"/>
@@ -1480,17 +1481,17 @@
         <w:tblLook w:val="04A0" w:firstRow="1" w:lastRow="0" w:firstColumn="1" w:lastColumn="0" w:noHBand="0" w:noVBand="1"/>
       </w:tblPr>
       <w:tblGrid>
-        <w:gridCol w:w="829"/>
-        <w:gridCol w:w="717"/>
-        <w:gridCol w:w="799"/>
-        <w:gridCol w:w="805"/>
-        <w:gridCol w:w="830"/>
-        <w:gridCol w:w="973"/>
-        <w:gridCol w:w="978"/>
-        <w:gridCol w:w="1101"/>
-        <w:gridCol w:w="876"/>
-        <w:gridCol w:w="897"/>
-        <w:gridCol w:w="1592"/>
+        <w:gridCol w:w="1268"/>
+        <w:gridCol w:w="921"/>
+        <w:gridCol w:w="922"/>
+        <w:gridCol w:w="922"/>
+        <w:gridCol w:w="922"/>
+        <w:gridCol w:w="922"/>
+        <w:gridCol w:w="922"/>
+        <w:gridCol w:w="922"/>
+        <w:gridCol w:w="922"/>
+        <w:gridCol w:w="922"/>
+        <w:gridCol w:w="922"/>
       </w:tblGrid>
       <w:tr>
         <w:trPr>
@@ -1498,7 +1499,7 @@
         </w:trPr>
         <w:tc>
           <w:tcPr>
-            <w:tcW w:w="829" w:type="dxa"/>
+            <w:tcW w:w="1418" w:type="dxa"/>
             <w:tcBorders>
               <w:top w:val="single" w:sz="2" w:space="0" w:color="000000"/>
               <w:left w:val="single" w:sz="2" w:space="0" w:color="000000"/>
@@ -1519,7 +1520,7 @@
             <w:pPr>
               <w:pStyle w:val="a3"/>
               <w:wordWrap/>
-              <w:spacing w:line="340" w:lineRule="exact"/>
+              <w:spacing w:line="240" w:lineRule="auto"/>
               <w:jc w:val="center"/>
               <w:rPr>
                 <w:shd w:val="pct15" w:color="auto" w:fill="FFFFFF"/>
@@ -1536,7 +1537,7 @@
         </w:tc>
         <w:tc>
           <w:tcPr>
-            <w:tcW w:w="0" w:type="auto"/>
+            <w:tcW w:w="1021" w:type="dxa"/>
             <w:tcBorders>
               <w:top w:val="single" w:sz="2" w:space="0" w:color="000000"/>
               <w:left w:val="single" w:sz="2" w:space="0" w:color="000000"/>
@@ -1557,7 +1558,7 @@
             <w:pPr>
               <w:pStyle w:val="a3"/>
               <w:wordWrap/>
-              <w:spacing w:line="340" w:lineRule="exact"/>
+              <w:spacing w:line="240" w:lineRule="auto"/>
               <w:jc w:val="center"/>
               <w:rPr>
                 <w:shd w:val="pct15" w:color="auto" w:fill="FFFFFF"/>
@@ -1576,7 +1577,7 @@
         </w:tc>
         <w:tc>
           <w:tcPr>
-            <w:tcW w:w="0" w:type="auto"/>
+            <w:tcW w:w="1021" w:type="dxa"/>
             <w:tcBorders>
               <w:top w:val="single" w:sz="2" w:space="0" w:color="000000"/>
               <w:left w:val="single" w:sz="2" w:space="0" w:color="000000"/>
@@ -1597,7 +1598,7 @@
             <w:pPr>
               <w:pStyle w:val="a3"/>
               <w:wordWrap/>
-              <w:spacing w:line="340" w:lineRule="exact"/>
+              <w:spacing w:line="240" w:lineRule="auto"/>
               <w:jc w:val="center"/>
               <w:rPr>
                 <w:sz w:val="14"/>
@@ -1616,7 +1617,7 @@
             <w:pPr>
               <w:pStyle w:val="a3"/>
               <w:wordWrap/>
-              <w:spacing w:line="340" w:lineRule="exact"/>
+              <w:spacing w:line="240" w:lineRule="auto"/>
               <w:jc w:val="center"/>
               <w:rPr>
                 <w:sz w:val="14"/>
@@ -1687,7 +1688,7 @@
         </w:tc>
         <w:tc>
           <w:tcPr>
-            <w:tcW w:w="0" w:type="auto"/>
+            <w:tcW w:w="1021" w:type="dxa"/>
             <w:tcBorders>
               <w:top w:val="single" w:sz="2" w:space="0" w:color="000000"/>
               <w:left w:val="single" w:sz="2" w:space="0" w:color="000000"/>
@@ -1708,7 +1709,7 @@
             <w:pPr>
               <w:pStyle w:val="a3"/>
               <w:wordWrap/>
-              <w:spacing w:line="340" w:lineRule="exact"/>
+              <w:spacing w:line="240" w:lineRule="auto"/>
               <w:jc w:val="center"/>
               <w:rPr>
                 <w:shd w:val="pct15" w:color="auto" w:fill="FFFFFF"/>
@@ -1727,7 +1728,7 @@
             <w:pPr>
               <w:pStyle w:val="a3"/>
               <w:wordWrap/>
-              <w:spacing w:line="340" w:lineRule="exact"/>
+              <w:spacing w:line="240" w:lineRule="auto"/>
               <w:jc w:val="center"/>
               <w:rPr>
                 <w:shd w:val="pct15" w:color="auto" w:fill="FFFFFF"/>
@@ -1746,7 +1747,7 @@
             <w:pPr>
               <w:pStyle w:val="a3"/>
               <w:wordWrap/>
-              <w:spacing w:line="340" w:lineRule="exact"/>
+              <w:spacing w:line="240" w:lineRule="auto"/>
               <w:jc w:val="center"/>
               <w:rPr>
                 <w:shd w:val="pct15" w:color="auto" w:fill="FFFFFF"/>
@@ -1773,7 +1774,7 @@
         </w:tc>
         <w:tc>
           <w:tcPr>
-            <w:tcW w:w="0" w:type="auto"/>
+            <w:tcW w:w="1021" w:type="dxa"/>
             <w:tcBorders>
               <w:top w:val="single" w:sz="2" w:space="0" w:color="000000"/>
               <w:left w:val="single" w:sz="2" w:space="0" w:color="000000"/>
@@ -1794,7 +1795,7 @@
             <w:pPr>
               <w:pStyle w:val="a3"/>
               <w:wordWrap/>
-              <w:spacing w:line="340" w:lineRule="exact"/>
+              <w:spacing w:line="240" w:lineRule="auto"/>
               <w:jc w:val="center"/>
               <w:rPr>
                 <w:shd w:val="pct15" w:color="auto" w:fill="FFFFFF"/>
@@ -1859,7 +1860,7 @@
         </w:tc>
         <w:tc>
           <w:tcPr>
-            <w:tcW w:w="0" w:type="auto"/>
+            <w:tcW w:w="1021" w:type="dxa"/>
             <w:tcBorders>
               <w:top w:val="single" w:sz="2" w:space="0" w:color="000000"/>
               <w:left w:val="single" w:sz="2" w:space="0" w:color="000000"/>
@@ -1880,7 +1881,7 @@
             <w:pPr>
               <w:pStyle w:val="a3"/>
               <w:wordWrap/>
-              <w:spacing w:line="340" w:lineRule="exact"/>
+              <w:spacing w:line="240" w:lineRule="auto"/>
               <w:ind w:left="780" w:hanging="780"/>
               <w:jc w:val="center"/>
               <w:rPr>
@@ -1904,7 +1905,7 @@
             <w:pPr>
               <w:pStyle w:val="a3"/>
               <w:wordWrap/>
-              <w:spacing w:line="340" w:lineRule="exact"/>
+              <w:spacing w:line="240" w:lineRule="auto"/>
               <w:ind w:left="780" w:hanging="780"/>
               <w:jc w:val="center"/>
               <w:rPr>
@@ -1928,7 +1929,7 @@
             <w:pPr>
               <w:pStyle w:val="a3"/>
               <w:wordWrap/>
-              <w:spacing w:line="340" w:lineRule="exact"/>
+              <w:spacing w:line="240" w:lineRule="auto"/>
               <w:jc w:val="center"/>
               <w:rPr>
                 <w:shd w:val="pct15" w:color="auto" w:fill="FFFFFF"/>
@@ -1957,7 +1958,7 @@
         </w:tc>
         <w:tc>
           <w:tcPr>
-            <w:tcW w:w="0" w:type="auto"/>
+            <w:tcW w:w="1021" w:type="dxa"/>
             <w:tcBorders>
               <w:top w:val="single" w:sz="2" w:space="0" w:color="000000"/>
               <w:left w:val="single" w:sz="2" w:space="0" w:color="000000"/>
@@ -1978,7 +1979,7 @@
             <w:pPr>
               <w:pStyle w:val="a3"/>
               <w:wordWrap/>
-              <w:spacing w:line="340" w:lineRule="exact"/>
+              <w:spacing w:line="240" w:lineRule="auto"/>
               <w:jc w:val="center"/>
               <w:rPr>
                 <w:shd w:val="pct15" w:color="auto" w:fill="FFFFFF"/>
@@ -2007,7 +2008,7 @@
         </w:tc>
         <w:tc>
           <w:tcPr>
-            <w:tcW w:w="0" w:type="auto"/>
+            <w:tcW w:w="1021" w:type="dxa"/>
             <w:tcBorders>
               <w:top w:val="single" w:sz="2" w:space="0" w:color="000000"/>
               <w:left w:val="single" w:sz="2" w:space="0" w:color="000000"/>
@@ -2028,7 +2029,7 @@
             <w:pPr>
               <w:pStyle w:val="a3"/>
               <w:wordWrap/>
-              <w:spacing w:line="340" w:lineRule="exact"/>
+              <w:spacing w:line="240" w:lineRule="auto"/>
               <w:ind w:left="780" w:hanging="780"/>
               <w:jc w:val="center"/>
               <w:rPr>
@@ -2052,7 +2053,7 @@
             <w:pPr>
               <w:pStyle w:val="a3"/>
               <w:wordWrap/>
-              <w:spacing w:line="340" w:lineRule="exact"/>
+              <w:spacing w:line="240" w:lineRule="auto"/>
               <w:ind w:left="780" w:hanging="780"/>
               <w:jc w:val="center"/>
               <w:rPr>
@@ -2076,7 +2077,7 @@
             <w:pPr>
               <w:pStyle w:val="a3"/>
               <w:wordWrap/>
-              <w:spacing w:line="340" w:lineRule="exact"/>
+              <w:spacing w:line="240" w:lineRule="auto"/>
               <w:ind w:left="780" w:hanging="780"/>
               <w:jc w:val="center"/>
               <w:rPr>
@@ -2096,7 +2097,7 @@
         </w:tc>
         <w:tc>
           <w:tcPr>
-            <w:tcW w:w="0" w:type="auto"/>
+            <w:tcW w:w="1021" w:type="dxa"/>
             <w:tcBorders>
               <w:top w:val="single" w:sz="2" w:space="0" w:color="000000"/>
               <w:left w:val="single" w:sz="2" w:space="0" w:color="000000"/>
@@ -2117,7 +2118,7 @@
             <w:pPr>
               <w:pStyle w:val="a3"/>
               <w:wordWrap/>
-              <w:spacing w:line="340" w:lineRule="exact"/>
+              <w:spacing w:line="240" w:lineRule="auto"/>
               <w:ind w:left="780" w:hanging="780"/>
               <w:jc w:val="center"/>
               <w:rPr>
@@ -2141,7 +2142,7 @@
             <w:pPr>
               <w:pStyle w:val="a3"/>
               <w:wordWrap/>
-              <w:spacing w:line="340" w:lineRule="exact"/>
+              <w:spacing w:line="240" w:lineRule="auto"/>
               <w:ind w:left="780" w:hanging="780"/>
               <w:jc w:val="center"/>
               <w:rPr>
@@ -2171,7 +2172,7 @@
         </w:tc>
         <w:tc>
           <w:tcPr>
-            <w:tcW w:w="0" w:type="auto"/>
+            <w:tcW w:w="1021" w:type="dxa"/>
             <w:tcBorders>
               <w:top w:val="single" w:sz="2" w:space="0" w:color="000000"/>
               <w:left w:val="single" w:sz="2" w:space="0" w:color="000000"/>
@@ -2192,7 +2193,7 @@
             <w:pPr>
               <w:pStyle w:val="a3"/>
               <w:wordWrap/>
-              <w:spacing w:line="340" w:lineRule="exact"/>
+              <w:spacing w:line="240" w:lineRule="auto"/>
               <w:ind w:left="780" w:hanging="780"/>
               <w:jc w:val="center"/>
               <w:rPr>
@@ -2216,7 +2217,7 @@
             <w:pPr>
               <w:pStyle w:val="a3"/>
               <w:wordWrap/>
-              <w:spacing w:line="340" w:lineRule="exact"/>
+              <w:spacing w:line="240" w:lineRule="auto"/>
               <w:ind w:left="780" w:hanging="780"/>
               <w:jc w:val="center"/>
               <w:rPr>
@@ -2246,7 +2247,7 @@
         </w:tc>
         <w:tc>
           <w:tcPr>
-            <w:tcW w:w="1132" w:type="dxa"/>
+            <w:tcW w:w="1021" w:type="dxa"/>
             <w:tcBorders>
               <w:top w:val="single" w:sz="2" w:space="0" w:color="000000"/>
               <w:left w:val="single" w:sz="2" w:space="0" w:color="000000"/>
@@ -2267,7 +2268,7 @@
             <w:pPr>
               <w:pStyle w:val="a3"/>
               <w:wordWrap/>
-              <w:spacing w:line="340" w:lineRule="exact"/>
+              <w:spacing w:line="240" w:lineRule="auto"/>
               <w:ind w:left="780" w:hanging="780"/>
               <w:jc w:val="center"/>
               <w:rPr>
@@ -2291,7 +2292,7 @@
             <w:pPr>
               <w:pStyle w:val="a3"/>
               <w:wordWrap/>
-              <w:spacing w:line="340" w:lineRule="exact"/>
+              <w:spacing w:line="240" w:lineRule="auto"/>
               <w:ind w:left="780" w:hanging="780"/>
               <w:jc w:val="center"/>
               <w:rPr>
@@ -2315,7 +2316,7 @@
             <w:pPr>
               <w:pStyle w:val="a3"/>
               <w:wordWrap/>
-              <w:spacing w:line="340" w:lineRule="exact"/>
+              <w:spacing w:line="240" w:lineRule="auto"/>
               <w:ind w:left="780" w:hanging="780"/>
               <w:jc w:val="center"/>
               <w:rPr>
@@ -2332,14 +2333,14 @@
                 <w:sz w:val="14"/>
                 <w:shd w:val="pct15" w:color="auto" w:fill="FFFFFF"/>
               </w:rPr>
-              <w:t>preparation for</w:t>
-            </w:r>
-          </w:p>
-          <w:p>
-            <w:pPr>
-              <w:pStyle w:val="a3"/>
-              <w:wordWrap/>
-              <w:spacing w:line="340" w:lineRule="exact"/>
+              <w:t xml:space="preserve">preparation </w:t>
+            </w:r>
+          </w:p>
+          <w:p>
+            <w:pPr>
+              <w:pStyle w:val="a3"/>
+              <w:wordWrap/>
+              <w:spacing w:line="240" w:lineRule="auto"/>
               <w:ind w:left="780" w:hanging="780"/>
               <w:jc w:val="center"/>
               <w:rPr>
@@ -2374,24 +2375,24 @@
         </w:trPr>
         <w:tc>
           <w:tcPr>
-            <w:tcW w:w="829" w:type="dxa"/>
-            <w:tcBorders>
-              <w:top w:val="single" w:sz="2" w:space="0" w:color="000000"/>
-              <w:left w:val="single" w:sz="2" w:space="0" w:color="000000"/>
-              <w:bottom w:val="single" w:sz="2" w:space="0" w:color="000000"/>
-              <w:right w:val="single" w:sz="2" w:space="0" w:color="000000"/>
-            </w:tcBorders>
-            <w:tcMar>
-              <w:top w:w="28" w:type="dxa"/>
-              <w:left w:w="102" w:type="dxa"/>
-              <w:bottom w:w="28" w:type="dxa"/>
-              <w:right w:w="102" w:type="dxa"/>
-            </w:tcMar>
-            <w:vAlign w:val="center"/>
-          </w:tcPr>
-          <w:p>
-            <w:pPr>
-              <w:spacing w:after="0" w:line="384" w:lineRule="auto"/>
+            <w:tcW w:w="1418" w:type="dxa"/>
+            <w:tcBorders>
+              <w:top w:val="single" w:sz="2" w:space="0" w:color="000000"/>
+              <w:left w:val="single" w:sz="2" w:space="0" w:color="000000"/>
+              <w:bottom w:val="single" w:sz="2" w:space="0" w:color="000000"/>
+              <w:right w:val="single" w:sz="2" w:space="0" w:color="000000"/>
+            </w:tcBorders>
+            <w:tcMar>
+              <w:top w:w="28" w:type="dxa"/>
+              <w:left w:w="102" w:type="dxa"/>
+              <w:bottom w:w="28" w:type="dxa"/>
+              <w:right w:w="102" w:type="dxa"/>
+            </w:tcMar>
+            <w:vAlign w:val="center"/>
+          </w:tcPr>
+          <w:p>
+            <w:pPr>
+              <w:spacing w:after="0" w:line="216" w:lineRule="auto"/>
               <w:jc w:val="center"/>
               <w:textAlignment w:val="baseline"/>
               <w:rPr>
@@ -2418,7 +2419,7 @@
         </w:tc>
         <w:tc>
           <w:tcPr>
-            <w:tcW w:w="0" w:type="auto"/>
+            <w:tcW w:w="1021" w:type="dxa"/>
             <w:tcBorders>
               <w:top w:val="single" w:sz="2" w:space="0" w:color="000000"/>
               <w:left w:val="single" w:sz="2" w:space="0" w:color="000000"/>
@@ -2439,7 +2440,7 @@
               <w:wordWrap/>
               <w:autoSpaceDE/>
               <w:autoSpaceDN/>
-              <w:spacing w:line="0" w:lineRule="atLeast"/>
+              <w:spacing w:line="216" w:lineRule="auto"/>
               <w:jc w:val="center"/>
               <w:rPr>
                 <w:rFonts w:hAnsi="함초롬바탕" w:cs="함초롬바탕"/>
@@ -2481,7 +2482,7 @@
         </w:tc>
         <w:tc>
           <w:tcPr>
-            <w:tcW w:w="0" w:type="auto"/>
+            <w:tcW w:w="1021" w:type="dxa"/>
             <w:tcBorders>
               <w:top w:val="single" w:sz="2" w:space="0" w:color="000000"/>
               <w:left w:val="single" w:sz="2" w:space="0" w:color="000000"/>
@@ -2502,38 +2503,38 @@
               <w:wordWrap/>
               <w:autoSpaceDE/>
               <w:autoSpaceDN/>
-              <w:spacing w:line="0" w:lineRule="atLeast"/>
-              <w:jc w:val="center"/>
+              <w:spacing w:line="216" w:lineRule="auto"/>
+              <w:jc w:val="center"/>
+              <w:rPr>
+                <w:rFonts w:hAnsi="함초롬바탕" w:cs="함초롬바탕"/>
+                <w:b/>
+                <w:color w:val="0000FF"/>
+                <w:sz w:val="14"/>
+              </w:rPr>
+            </w:pPr>
+            <w:r>
+              <w:rPr>
+                <w:rFonts w:hAnsi="함초롬바탕" w:cs="함초롬바탕"/>
+                <w:b/>
+                <w:color w:val="0000FF"/>
+                <w:sz w:val="14"/>
+              </w:rPr>
+              <w:t>{</w:t>
+            </w:r>
+            <w:r>
               <w:rPr>
                 <w:rFonts w:hAnsi="함초롬바탕" w:cs="함초롬바탕" w:hint="eastAsia"/>
                 <w:b/>
                 <w:color w:val="0000FF"/>
                 <w:sz w:val="14"/>
               </w:rPr>
-            </w:pPr>
-            <w:r>
-              <w:rPr>
-                <w:rFonts w:hAnsi="함초롬바탕" w:cs="함초롬바탕"/>
-                <w:b/>
-                <w:color w:val="0000FF"/>
-                <w:sz w:val="14"/>
-              </w:rPr>
-              <w:t>{</w:t>
-            </w:r>
-            <w:r>
-              <w:rPr>
-                <w:rFonts w:hAnsi="함초롬바탕" w:cs="함초롬바탕" w:hint="eastAsia"/>
-                <w:b/>
-                <w:color w:val="0000FF"/>
-                <w:sz w:val="14"/>
-              </w:rPr>
               <w:t>min} ~ {max}</w:t>
             </w:r>
           </w:p>
         </w:tc>
         <w:tc>
           <w:tcPr>
-            <w:tcW w:w="0" w:type="auto"/>
+            <w:tcW w:w="1021" w:type="dxa"/>
             <w:tcBorders>
               <w:top w:val="single" w:sz="2" w:space="0" w:color="000000"/>
               <w:left w:val="single" w:sz="2" w:space="0" w:color="000000"/>
@@ -2554,7 +2555,7 @@
               <w:wordWrap/>
               <w:autoSpaceDE/>
               <w:autoSpaceDN/>
-              <w:spacing w:line="0" w:lineRule="atLeast"/>
+              <w:spacing w:line="216" w:lineRule="auto"/>
               <w:jc w:val="center"/>
               <w:rPr>
                 <w:rFonts w:hAnsi="함초롬바탕" w:cs="함초롬바탕"/>
@@ -2596,24 +2597,24 @@
         </w:tc>
         <w:tc>
           <w:tcPr>
-            <w:tcW w:w="0" w:type="auto"/>
-            <w:tcBorders>
-              <w:top w:val="single" w:sz="2" w:space="0" w:color="000000"/>
-              <w:left w:val="single" w:sz="2" w:space="0" w:color="000000"/>
-              <w:bottom w:val="single" w:sz="2" w:space="0" w:color="000000"/>
-              <w:right w:val="single" w:sz="2" w:space="0" w:color="000000"/>
-            </w:tcBorders>
-            <w:tcMar>
-              <w:top w:w="28" w:type="dxa"/>
-              <w:left w:w="102" w:type="dxa"/>
-              <w:bottom w:w="28" w:type="dxa"/>
-              <w:right w:w="102" w:type="dxa"/>
-            </w:tcMar>
-            <w:vAlign w:val="center"/>
-          </w:tcPr>
-          <w:p>
-            <w:pPr>
-              <w:spacing w:after="0" w:line="360" w:lineRule="auto"/>
+            <w:tcW w:w="1021" w:type="dxa"/>
+            <w:tcBorders>
+              <w:top w:val="single" w:sz="2" w:space="0" w:color="000000"/>
+              <w:left w:val="single" w:sz="2" w:space="0" w:color="000000"/>
+              <w:bottom w:val="single" w:sz="2" w:space="0" w:color="000000"/>
+              <w:right w:val="single" w:sz="2" w:space="0" w:color="000000"/>
+            </w:tcBorders>
+            <w:tcMar>
+              <w:top w:w="28" w:type="dxa"/>
+              <w:left w:w="102" w:type="dxa"/>
+              <w:bottom w:w="28" w:type="dxa"/>
+              <w:right w:w="102" w:type="dxa"/>
+            </w:tcMar>
+            <w:vAlign w:val="center"/>
+          </w:tcPr>
+          <w:p>
+            <w:pPr>
+              <w:spacing w:after="0" w:line="216" w:lineRule="auto"/>
               <w:ind w:left="780" w:hanging="780"/>
               <w:jc w:val="center"/>
               <w:textAlignment w:val="baseline"/>
@@ -2665,24 +2666,24 @@
         </w:tc>
         <w:tc>
           <w:tcPr>
-            <w:tcW w:w="0" w:type="auto"/>
-            <w:tcBorders>
-              <w:top w:val="single" w:sz="2" w:space="0" w:color="000000"/>
-              <w:left w:val="single" w:sz="2" w:space="0" w:color="000000"/>
-              <w:bottom w:val="single" w:sz="2" w:space="0" w:color="000000"/>
-              <w:right w:val="single" w:sz="2" w:space="0" w:color="000000"/>
-            </w:tcBorders>
-            <w:tcMar>
-              <w:top w:w="28" w:type="dxa"/>
-              <w:left w:w="102" w:type="dxa"/>
-              <w:bottom w:w="28" w:type="dxa"/>
-              <w:right w:w="102" w:type="dxa"/>
-            </w:tcMar>
-            <w:vAlign w:val="center"/>
-          </w:tcPr>
-          <w:p>
-            <w:pPr>
-              <w:spacing w:after="0" w:line="360" w:lineRule="auto"/>
+            <w:tcW w:w="1021" w:type="dxa"/>
+            <w:tcBorders>
+              <w:top w:val="single" w:sz="2" w:space="0" w:color="000000"/>
+              <w:left w:val="single" w:sz="2" w:space="0" w:color="000000"/>
+              <w:bottom w:val="single" w:sz="2" w:space="0" w:color="000000"/>
+              <w:right w:val="single" w:sz="2" w:space="0" w:color="000000"/>
+            </w:tcBorders>
+            <w:tcMar>
+              <w:top w:w="28" w:type="dxa"/>
+              <w:left w:w="102" w:type="dxa"/>
+              <w:bottom w:w="28" w:type="dxa"/>
+              <w:right w:w="102" w:type="dxa"/>
+            </w:tcMar>
+            <w:vAlign w:val="center"/>
+          </w:tcPr>
+          <w:p>
+            <w:pPr>
+              <w:spacing w:after="0" w:line="216" w:lineRule="auto"/>
               <w:ind w:left="780" w:hanging="780"/>
               <w:jc w:val="center"/>
               <w:textAlignment w:val="baseline"/>
@@ -2734,24 +2735,24 @@
         </w:tc>
         <w:tc>
           <w:tcPr>
-            <w:tcW w:w="0" w:type="auto"/>
-            <w:tcBorders>
-              <w:top w:val="single" w:sz="2" w:space="0" w:color="000000"/>
-              <w:left w:val="single" w:sz="2" w:space="0" w:color="000000"/>
-              <w:bottom w:val="single" w:sz="2" w:space="0" w:color="000000"/>
-              <w:right w:val="single" w:sz="2" w:space="0" w:color="000000"/>
-            </w:tcBorders>
-            <w:tcMar>
-              <w:top w:w="28" w:type="dxa"/>
-              <w:left w:w="102" w:type="dxa"/>
-              <w:bottom w:w="28" w:type="dxa"/>
-              <w:right w:w="102" w:type="dxa"/>
-            </w:tcMar>
-            <w:vAlign w:val="center"/>
-          </w:tcPr>
-          <w:p>
-            <w:pPr>
-              <w:spacing w:after="0" w:line="360" w:lineRule="auto"/>
+            <w:tcW w:w="1021" w:type="dxa"/>
+            <w:tcBorders>
+              <w:top w:val="single" w:sz="2" w:space="0" w:color="000000"/>
+              <w:left w:val="single" w:sz="2" w:space="0" w:color="000000"/>
+              <w:bottom w:val="single" w:sz="2" w:space="0" w:color="000000"/>
+              <w:right w:val="single" w:sz="2" w:space="0" w:color="000000"/>
+            </w:tcBorders>
+            <w:tcMar>
+              <w:top w:w="28" w:type="dxa"/>
+              <w:left w:w="102" w:type="dxa"/>
+              <w:bottom w:w="28" w:type="dxa"/>
+              <w:right w:w="102" w:type="dxa"/>
+            </w:tcMar>
+            <w:vAlign w:val="center"/>
+          </w:tcPr>
+          <w:p>
+            <w:pPr>
+              <w:spacing w:after="0" w:line="216" w:lineRule="auto"/>
               <w:ind w:left="780" w:hanging="780"/>
               <w:jc w:val="center"/>
               <w:textAlignment w:val="baseline"/>
@@ -2803,24 +2804,24 @@
         </w:tc>
         <w:tc>
           <w:tcPr>
-            <w:tcW w:w="0" w:type="auto"/>
-            <w:tcBorders>
-              <w:top w:val="single" w:sz="2" w:space="0" w:color="000000"/>
-              <w:left w:val="single" w:sz="2" w:space="0" w:color="000000"/>
-              <w:bottom w:val="single" w:sz="2" w:space="0" w:color="000000"/>
-              <w:right w:val="single" w:sz="2" w:space="0" w:color="000000"/>
-            </w:tcBorders>
-            <w:tcMar>
-              <w:top w:w="28" w:type="dxa"/>
-              <w:left w:w="102" w:type="dxa"/>
-              <w:bottom w:w="28" w:type="dxa"/>
-              <w:right w:w="102" w:type="dxa"/>
-            </w:tcMar>
-            <w:vAlign w:val="center"/>
-          </w:tcPr>
-          <w:p>
-            <w:pPr>
-              <w:spacing w:after="0" w:line="360" w:lineRule="auto"/>
+            <w:tcW w:w="1021" w:type="dxa"/>
+            <w:tcBorders>
+              <w:top w:val="single" w:sz="2" w:space="0" w:color="000000"/>
+              <w:left w:val="single" w:sz="2" w:space="0" w:color="000000"/>
+              <w:bottom w:val="single" w:sz="2" w:space="0" w:color="000000"/>
+              <w:right w:val="single" w:sz="2" w:space="0" w:color="000000"/>
+            </w:tcBorders>
+            <w:tcMar>
+              <w:top w:w="28" w:type="dxa"/>
+              <w:left w:w="102" w:type="dxa"/>
+              <w:bottom w:w="28" w:type="dxa"/>
+              <w:right w:w="102" w:type="dxa"/>
+            </w:tcMar>
+            <w:vAlign w:val="center"/>
+          </w:tcPr>
+          <w:p>
+            <w:pPr>
+              <w:spacing w:after="0" w:line="216" w:lineRule="auto"/>
               <w:ind w:left="780" w:hanging="780"/>
               <w:jc w:val="center"/>
               <w:textAlignment w:val="baseline"/>
@@ -2872,24 +2873,24 @@
         </w:tc>
         <w:tc>
           <w:tcPr>
-            <w:tcW w:w="0" w:type="auto"/>
-            <w:tcBorders>
-              <w:top w:val="single" w:sz="2" w:space="0" w:color="000000"/>
-              <w:left w:val="single" w:sz="2" w:space="0" w:color="000000"/>
-              <w:bottom w:val="single" w:sz="2" w:space="0" w:color="000000"/>
-              <w:right w:val="single" w:sz="2" w:space="0" w:color="000000"/>
-            </w:tcBorders>
-            <w:tcMar>
-              <w:top w:w="28" w:type="dxa"/>
-              <w:left w:w="102" w:type="dxa"/>
-              <w:bottom w:w="28" w:type="dxa"/>
-              <w:right w:w="102" w:type="dxa"/>
-            </w:tcMar>
-            <w:vAlign w:val="center"/>
-          </w:tcPr>
-          <w:p>
-            <w:pPr>
-              <w:spacing w:after="0" w:line="360" w:lineRule="auto"/>
+            <w:tcW w:w="1021" w:type="dxa"/>
+            <w:tcBorders>
+              <w:top w:val="single" w:sz="2" w:space="0" w:color="000000"/>
+              <w:left w:val="single" w:sz="2" w:space="0" w:color="000000"/>
+              <w:bottom w:val="single" w:sz="2" w:space="0" w:color="000000"/>
+              <w:right w:val="single" w:sz="2" w:space="0" w:color="000000"/>
+            </w:tcBorders>
+            <w:tcMar>
+              <w:top w:w="28" w:type="dxa"/>
+              <w:left w:w="102" w:type="dxa"/>
+              <w:bottom w:w="28" w:type="dxa"/>
+              <w:right w:w="102" w:type="dxa"/>
+            </w:tcMar>
+            <w:vAlign w:val="center"/>
+          </w:tcPr>
+          <w:p>
+            <w:pPr>
+              <w:spacing w:after="0" w:line="216" w:lineRule="auto"/>
               <w:ind w:left="780" w:hanging="780"/>
               <w:jc w:val="center"/>
               <w:textAlignment w:val="baseline"/>
@@ -2941,24 +2942,24 @@
         </w:tc>
         <w:tc>
           <w:tcPr>
-            <w:tcW w:w="0" w:type="auto"/>
-            <w:tcBorders>
-              <w:top w:val="single" w:sz="2" w:space="0" w:color="000000"/>
-              <w:left w:val="single" w:sz="2" w:space="0" w:color="000000"/>
-              <w:bottom w:val="single" w:sz="2" w:space="0" w:color="000000"/>
-              <w:right w:val="single" w:sz="2" w:space="0" w:color="000000"/>
-            </w:tcBorders>
-            <w:tcMar>
-              <w:top w:w="28" w:type="dxa"/>
-              <w:left w:w="102" w:type="dxa"/>
-              <w:bottom w:w="28" w:type="dxa"/>
-              <w:right w:w="102" w:type="dxa"/>
-            </w:tcMar>
-            <w:vAlign w:val="center"/>
-          </w:tcPr>
-          <w:p>
-            <w:pPr>
-              <w:spacing w:after="0" w:line="360" w:lineRule="auto"/>
+            <w:tcW w:w="1021" w:type="dxa"/>
+            <w:tcBorders>
+              <w:top w:val="single" w:sz="2" w:space="0" w:color="000000"/>
+              <w:left w:val="single" w:sz="2" w:space="0" w:color="000000"/>
+              <w:bottom w:val="single" w:sz="2" w:space="0" w:color="000000"/>
+              <w:right w:val="single" w:sz="2" w:space="0" w:color="000000"/>
+            </w:tcBorders>
+            <w:tcMar>
+              <w:top w:w="28" w:type="dxa"/>
+              <w:left w:w="102" w:type="dxa"/>
+              <w:bottom w:w="28" w:type="dxa"/>
+              <w:right w:w="102" w:type="dxa"/>
+            </w:tcMar>
+            <w:vAlign w:val="center"/>
+          </w:tcPr>
+          <w:p>
+            <w:pPr>
+              <w:spacing w:after="0" w:line="216" w:lineRule="auto"/>
               <w:ind w:left="780" w:hanging="780"/>
               <w:jc w:val="center"/>
               <w:textAlignment w:val="baseline"/>
@@ -3010,24 +3011,24 @@
         </w:tc>
         <w:tc>
           <w:tcPr>
-            <w:tcW w:w="1132" w:type="dxa"/>
-            <w:tcBorders>
-              <w:top w:val="single" w:sz="2" w:space="0" w:color="000000"/>
-              <w:left w:val="single" w:sz="2" w:space="0" w:color="000000"/>
-              <w:bottom w:val="single" w:sz="2" w:space="0" w:color="000000"/>
-              <w:right w:val="single" w:sz="2" w:space="0" w:color="000000"/>
-            </w:tcBorders>
-            <w:tcMar>
-              <w:top w:w="28" w:type="dxa"/>
-              <w:left w:w="102" w:type="dxa"/>
-              <w:bottom w:w="28" w:type="dxa"/>
-              <w:right w:w="102" w:type="dxa"/>
-            </w:tcMar>
-            <w:vAlign w:val="center"/>
-          </w:tcPr>
-          <w:p>
-            <w:pPr>
-              <w:spacing w:after="0" w:line="360" w:lineRule="auto"/>
+            <w:tcW w:w="1021" w:type="dxa"/>
+            <w:tcBorders>
+              <w:top w:val="single" w:sz="2" w:space="0" w:color="000000"/>
+              <w:left w:val="single" w:sz="2" w:space="0" w:color="000000"/>
+              <w:bottom w:val="single" w:sz="2" w:space="0" w:color="000000"/>
+              <w:right w:val="single" w:sz="2" w:space="0" w:color="000000"/>
+            </w:tcBorders>
+            <w:tcMar>
+              <w:top w:w="28" w:type="dxa"/>
+              <w:left w:w="102" w:type="dxa"/>
+              <w:bottom w:w="28" w:type="dxa"/>
+              <w:right w:w="102" w:type="dxa"/>
+            </w:tcMar>
+            <w:vAlign w:val="center"/>
+          </w:tcPr>
+          <w:p>
+            <w:pPr>
+              <w:spacing w:after="0" w:line="216" w:lineRule="auto"/>
               <w:ind w:left="780" w:hanging="780"/>
               <w:jc w:val="center"/>
               <w:textAlignment w:val="baseline"/>
@@ -3073,7 +3074,44 @@
                 <w:sz w:val="14"/>
                 <w:szCs w:val="14"/>
               </w:rPr>
-              <w:t>} {/comps}</w:t>
+              <w:t>}</w:t>
+            </w:r>
+          </w:p>
+          <w:p>
+            <w:pPr>
+              <w:spacing w:after="0" w:line="216" w:lineRule="auto"/>
+              <w:ind w:left="780" w:hanging="780"/>
+              <w:jc w:val="center"/>
+              <w:textAlignment w:val="baseline"/>
+              <w:rPr>
+                <w:rFonts w:ascii="함초롬바탕" w:eastAsia="함초롬바탕" w:hAnsi="함초롬바탕" w:cs="함초롬바탕"/>
+                <w:b/>
+                <w:bCs/>
+                <w:color w:val="0000FF"/>
+                <w:sz w:val="14"/>
+                <w:szCs w:val="14"/>
+              </w:rPr>
+            </w:pPr>
+            <w:r>
+              <w:rPr>
+                <w:rFonts w:ascii="함초롬바탕" w:eastAsia="함초롬바탕" w:hAnsi="함초롬바탕" w:cs="함초롬바탕" w:hint="eastAsia"/>
+                <w:b/>
+                <w:bCs/>
+                <w:color w:val="0000FF"/>
+                <w:sz w:val="14"/>
+                <w:szCs w:val="14"/>
+              </w:rPr>
+              <w:t>{/comps}</w:t>
+            </w:r>
+            <w:r>
+              <w:rPr>
+                <w:rFonts w:ascii="함초롬바탕" w:eastAsia="함초롬바탕" w:hAnsi="함초롬바탕" w:cs="함초롬바탕"/>
+                <w:b/>
+                <w:bCs/>
+                <w:color w:val="0000FF"/>
+                <w:sz w:val="14"/>
+                <w:szCs w:val="14"/>
+              </w:rPr>
             </w:r>
           </w:p>
         </w:tc>
@@ -3084,7 +3122,7 @@
         </w:trPr>
         <w:tc>
           <w:tcPr>
-            <w:tcW w:w="829" w:type="dxa"/>
+            <w:tcW w:w="1418" w:type="dxa"/>
             <w:tcBorders>
               <w:top w:val="single" w:sz="2" w:space="0" w:color="000000"/>
               <w:left w:val="single" w:sz="2" w:space="0" w:color="000000"/>
@@ -3105,7 +3143,7 @@
               <w:wordWrap/>
               <w:autoSpaceDE/>
               <w:autoSpaceDN/>
-              <w:spacing w:line="0" w:lineRule="atLeast"/>
+              <w:spacing w:line="216" w:lineRule="auto"/>
               <w:jc w:val="center"/>
               <w:rPr>
                 <w:rFonts w:hAnsi="함초롬바탕" w:cs="함초롬바탕"/>
@@ -3127,7 +3165,7 @@
         </w:tc>
         <w:tc>
           <w:tcPr>
-            <w:tcW w:w="0" w:type="auto"/>
+            <w:tcW w:w="1021" w:type="dxa"/>
             <w:tcBorders>
               <w:top w:val="single" w:sz="2" w:space="0" w:color="000000"/>
               <w:left w:val="single" w:sz="2" w:space="0" w:color="000000"/>
@@ -3148,7 +3186,7 @@
               <w:wordWrap/>
               <w:autoSpaceDE/>
               <w:autoSpaceDN/>
-              <w:spacing w:line="0" w:lineRule="atLeast"/>
+              <w:spacing w:line="216" w:lineRule="auto"/>
               <w:jc w:val="center"/>
               <w:rPr>
                 <w:rFonts w:hAnsi="함초롬바탕" w:cs="함초롬바탕"/>
@@ -3161,7 +3199,7 @@
         </w:tc>
         <w:tc>
           <w:tcPr>
-            <w:tcW w:w="0" w:type="auto"/>
+            <w:tcW w:w="1021" w:type="dxa"/>
             <w:tcBorders>
               <w:top w:val="single" w:sz="2" w:space="0" w:color="000000"/>
               <w:left w:val="single" w:sz="2" w:space="0" w:color="000000"/>
@@ -3182,7 +3220,7 @@
               <w:wordWrap/>
               <w:autoSpaceDE/>
               <w:autoSpaceDN/>
-              <w:spacing w:line="0" w:lineRule="atLeast"/>
+              <w:spacing w:line="216" w:lineRule="auto"/>
               <w:jc w:val="center"/>
               <w:rPr>
                 <w:rFonts w:hAnsi="함초롬바탕" w:cs="함초롬바탕"/>
@@ -3204,7 +3242,7 @@
         </w:tc>
         <w:tc>
           <w:tcPr>
-            <w:tcW w:w="0" w:type="auto"/>
+            <w:tcW w:w="1021" w:type="dxa"/>
             <w:tcBorders>
               <w:top w:val="single" w:sz="2" w:space="0" w:color="000000"/>
               <w:left w:val="single" w:sz="2" w:space="0" w:color="000000"/>
@@ -3225,7 +3263,7 @@
               <w:wordWrap/>
               <w:autoSpaceDE/>
               <w:autoSpaceDN/>
-              <w:spacing w:line="0" w:lineRule="atLeast"/>
+              <w:spacing w:line="216" w:lineRule="auto"/>
               <w:jc w:val="center"/>
               <w:rPr>
                 <w:rFonts w:hAnsi="함초롬바탕" w:cs="함초롬바탕"/>
@@ -3247,24 +3285,24 @@
         </w:tc>
         <w:tc>
           <w:tcPr>
-            <w:tcW w:w="0" w:type="auto"/>
-            <w:tcBorders>
-              <w:top w:val="single" w:sz="2" w:space="0" w:color="000000"/>
-              <w:left w:val="single" w:sz="2" w:space="0" w:color="000000"/>
-              <w:bottom w:val="single" w:sz="2" w:space="0" w:color="000000"/>
-              <w:right w:val="single" w:sz="2" w:space="0" w:color="000000"/>
-            </w:tcBorders>
-            <w:tcMar>
-              <w:top w:w="28" w:type="dxa"/>
-              <w:left w:w="102" w:type="dxa"/>
-              <w:bottom w:w="28" w:type="dxa"/>
-              <w:right w:w="102" w:type="dxa"/>
-            </w:tcMar>
-            <w:vAlign w:val="center"/>
-          </w:tcPr>
-          <w:p>
-            <w:pPr>
-              <w:spacing w:after="0" w:line="360" w:lineRule="auto"/>
+            <w:tcW w:w="1021" w:type="dxa"/>
+            <w:tcBorders>
+              <w:top w:val="single" w:sz="2" w:space="0" w:color="000000"/>
+              <w:left w:val="single" w:sz="2" w:space="0" w:color="000000"/>
+              <w:bottom w:val="single" w:sz="2" w:space="0" w:color="000000"/>
+              <w:right w:val="single" w:sz="2" w:space="0" w:color="000000"/>
+            </w:tcBorders>
+            <w:tcMar>
+              <w:top w:w="28" w:type="dxa"/>
+              <w:left w:w="102" w:type="dxa"/>
+              <w:bottom w:w="28" w:type="dxa"/>
+              <w:right w:w="102" w:type="dxa"/>
+            </w:tcMar>
+            <w:vAlign w:val="center"/>
+          </w:tcPr>
+          <w:p>
+            <w:pPr>
+              <w:spacing w:after="0" w:line="216" w:lineRule="auto"/>
               <w:ind w:left="780" w:hanging="780"/>
               <w:jc w:val="center"/>
               <w:textAlignment w:val="baseline"/>
@@ -3281,24 +3319,24 @@
         </w:tc>
         <w:tc>
           <w:tcPr>
-            <w:tcW w:w="0" w:type="auto"/>
-            <w:tcBorders>
-              <w:top w:val="single" w:sz="2" w:space="0" w:color="000000"/>
-              <w:left w:val="single" w:sz="2" w:space="0" w:color="000000"/>
-              <w:bottom w:val="single" w:sz="2" w:space="0" w:color="000000"/>
-              <w:right w:val="single" w:sz="2" w:space="0" w:color="000000"/>
-            </w:tcBorders>
-            <w:tcMar>
-              <w:top w:w="28" w:type="dxa"/>
-              <w:left w:w="102" w:type="dxa"/>
-              <w:bottom w:w="28" w:type="dxa"/>
-              <w:right w:w="102" w:type="dxa"/>
-            </w:tcMar>
-            <w:vAlign w:val="center"/>
-          </w:tcPr>
-          <w:p>
-            <w:pPr>
-              <w:spacing w:after="0" w:line="360" w:lineRule="auto"/>
+            <w:tcW w:w="1021" w:type="dxa"/>
+            <w:tcBorders>
+              <w:top w:val="single" w:sz="2" w:space="0" w:color="000000"/>
+              <w:left w:val="single" w:sz="2" w:space="0" w:color="000000"/>
+              <w:bottom w:val="single" w:sz="2" w:space="0" w:color="000000"/>
+              <w:right w:val="single" w:sz="2" w:space="0" w:color="000000"/>
+            </w:tcBorders>
+            <w:tcMar>
+              <w:top w:w="28" w:type="dxa"/>
+              <w:left w:w="102" w:type="dxa"/>
+              <w:bottom w:w="28" w:type="dxa"/>
+              <w:right w:w="102" w:type="dxa"/>
+            </w:tcMar>
+            <w:vAlign w:val="center"/>
+          </w:tcPr>
+          <w:p>
+            <w:pPr>
+              <w:spacing w:after="0" w:line="216" w:lineRule="auto"/>
               <w:ind w:left="780" w:hanging="780"/>
               <w:jc w:val="center"/>
               <w:textAlignment w:val="baseline"/>
@@ -3315,24 +3353,24 @@
         </w:tc>
         <w:tc>
           <w:tcPr>
-            <w:tcW w:w="0" w:type="auto"/>
-            <w:tcBorders>
-              <w:top w:val="single" w:sz="2" w:space="0" w:color="000000"/>
-              <w:left w:val="single" w:sz="2" w:space="0" w:color="000000"/>
-              <w:bottom w:val="single" w:sz="2" w:space="0" w:color="000000"/>
-              <w:right w:val="single" w:sz="2" w:space="0" w:color="000000"/>
-            </w:tcBorders>
-            <w:tcMar>
-              <w:top w:w="28" w:type="dxa"/>
-              <w:left w:w="102" w:type="dxa"/>
-              <w:bottom w:w="28" w:type="dxa"/>
-              <w:right w:w="102" w:type="dxa"/>
-            </w:tcMar>
-            <w:vAlign w:val="center"/>
-          </w:tcPr>
-          <w:p>
-            <w:pPr>
-              <w:spacing w:after="0" w:line="360" w:lineRule="auto"/>
+            <w:tcW w:w="1021" w:type="dxa"/>
+            <w:tcBorders>
+              <w:top w:val="single" w:sz="2" w:space="0" w:color="000000"/>
+              <w:left w:val="single" w:sz="2" w:space="0" w:color="000000"/>
+              <w:bottom w:val="single" w:sz="2" w:space="0" w:color="000000"/>
+              <w:right w:val="single" w:sz="2" w:space="0" w:color="000000"/>
+            </w:tcBorders>
+            <w:tcMar>
+              <w:top w:w="28" w:type="dxa"/>
+              <w:left w:w="102" w:type="dxa"/>
+              <w:bottom w:w="28" w:type="dxa"/>
+              <w:right w:w="102" w:type="dxa"/>
+            </w:tcMar>
+            <w:vAlign w:val="center"/>
+          </w:tcPr>
+          <w:p>
+            <w:pPr>
+              <w:spacing w:after="0" w:line="216" w:lineRule="auto"/>
               <w:ind w:left="780" w:hanging="780"/>
               <w:jc w:val="center"/>
               <w:textAlignment w:val="baseline"/>
@@ -3349,24 +3387,24 @@
         </w:tc>
         <w:tc>
           <w:tcPr>
-            <w:tcW w:w="0" w:type="auto"/>
-            <w:tcBorders>
-              <w:top w:val="single" w:sz="2" w:space="0" w:color="000000"/>
-              <w:left w:val="single" w:sz="2" w:space="0" w:color="000000"/>
-              <w:bottom w:val="single" w:sz="2" w:space="0" w:color="000000"/>
-              <w:right w:val="single" w:sz="2" w:space="0" w:color="000000"/>
-            </w:tcBorders>
-            <w:tcMar>
-              <w:top w:w="28" w:type="dxa"/>
-              <w:left w:w="102" w:type="dxa"/>
-              <w:bottom w:w="28" w:type="dxa"/>
-              <w:right w:w="102" w:type="dxa"/>
-            </w:tcMar>
-            <w:vAlign w:val="center"/>
-          </w:tcPr>
-          <w:p>
-            <w:pPr>
-              <w:spacing w:after="0" w:line="360" w:lineRule="auto"/>
+            <w:tcW w:w="1021" w:type="dxa"/>
+            <w:tcBorders>
+              <w:top w:val="single" w:sz="2" w:space="0" w:color="000000"/>
+              <w:left w:val="single" w:sz="2" w:space="0" w:color="000000"/>
+              <w:bottom w:val="single" w:sz="2" w:space="0" w:color="000000"/>
+              <w:right w:val="single" w:sz="2" w:space="0" w:color="000000"/>
+            </w:tcBorders>
+            <w:tcMar>
+              <w:top w:w="28" w:type="dxa"/>
+              <w:left w:w="102" w:type="dxa"/>
+              <w:bottom w:w="28" w:type="dxa"/>
+              <w:right w:w="102" w:type="dxa"/>
+            </w:tcMar>
+            <w:vAlign w:val="center"/>
+          </w:tcPr>
+          <w:p>
+            <w:pPr>
+              <w:spacing w:after="0" w:line="216" w:lineRule="auto"/>
               <w:ind w:left="780" w:hanging="780"/>
               <w:jc w:val="center"/>
               <w:textAlignment w:val="baseline"/>
@@ -3383,24 +3421,24 @@
         </w:tc>
         <w:tc>
           <w:tcPr>
-            <w:tcW w:w="0" w:type="auto"/>
-            <w:tcBorders>
-              <w:top w:val="single" w:sz="2" w:space="0" w:color="000000"/>
-              <w:left w:val="single" w:sz="2" w:space="0" w:color="000000"/>
-              <w:bottom w:val="single" w:sz="2" w:space="0" w:color="000000"/>
-              <w:right w:val="single" w:sz="2" w:space="0" w:color="000000"/>
-            </w:tcBorders>
-            <w:tcMar>
-              <w:top w:w="28" w:type="dxa"/>
-              <w:left w:w="102" w:type="dxa"/>
-              <w:bottom w:w="28" w:type="dxa"/>
-              <w:right w:w="102" w:type="dxa"/>
-            </w:tcMar>
-            <w:vAlign w:val="center"/>
-          </w:tcPr>
-          <w:p>
-            <w:pPr>
-              <w:spacing w:after="0" w:line="360" w:lineRule="auto"/>
+            <w:tcW w:w="1021" w:type="dxa"/>
+            <w:tcBorders>
+              <w:top w:val="single" w:sz="2" w:space="0" w:color="000000"/>
+              <w:left w:val="single" w:sz="2" w:space="0" w:color="000000"/>
+              <w:bottom w:val="single" w:sz="2" w:space="0" w:color="000000"/>
+              <w:right w:val="single" w:sz="2" w:space="0" w:color="000000"/>
+            </w:tcBorders>
+            <w:tcMar>
+              <w:top w:w="28" w:type="dxa"/>
+              <w:left w:w="102" w:type="dxa"/>
+              <w:bottom w:w="28" w:type="dxa"/>
+              <w:right w:w="102" w:type="dxa"/>
+            </w:tcMar>
+            <w:vAlign w:val="center"/>
+          </w:tcPr>
+          <w:p>
+            <w:pPr>
+              <w:spacing w:after="0" w:line="216" w:lineRule="auto"/>
               <w:ind w:left="780" w:hanging="780"/>
               <w:jc w:val="center"/>
               <w:textAlignment w:val="baseline"/>
@@ -3417,24 +3455,24 @@
         </w:tc>
         <w:tc>
           <w:tcPr>
-            <w:tcW w:w="0" w:type="auto"/>
-            <w:tcBorders>
-              <w:top w:val="single" w:sz="2" w:space="0" w:color="000000"/>
-              <w:left w:val="single" w:sz="2" w:space="0" w:color="000000"/>
-              <w:bottom w:val="single" w:sz="2" w:space="0" w:color="000000"/>
-              <w:right w:val="single" w:sz="2" w:space="0" w:color="000000"/>
-            </w:tcBorders>
-            <w:tcMar>
-              <w:top w:w="28" w:type="dxa"/>
-              <w:left w:w="102" w:type="dxa"/>
-              <w:bottom w:w="28" w:type="dxa"/>
-              <w:right w:w="102" w:type="dxa"/>
-            </w:tcMar>
-            <w:vAlign w:val="center"/>
-          </w:tcPr>
-          <w:p>
-            <w:pPr>
-              <w:spacing w:after="0" w:line="360" w:lineRule="auto"/>
+            <w:tcW w:w="1021" w:type="dxa"/>
+            <w:tcBorders>
+              <w:top w:val="single" w:sz="2" w:space="0" w:color="000000"/>
+              <w:left w:val="single" w:sz="2" w:space="0" w:color="000000"/>
+              <w:bottom w:val="single" w:sz="2" w:space="0" w:color="000000"/>
+              <w:right w:val="single" w:sz="2" w:space="0" w:color="000000"/>
+            </w:tcBorders>
+            <w:tcMar>
+              <w:top w:w="28" w:type="dxa"/>
+              <w:left w:w="102" w:type="dxa"/>
+              <w:bottom w:w="28" w:type="dxa"/>
+              <w:right w:w="102" w:type="dxa"/>
+            </w:tcMar>
+            <w:vAlign w:val="center"/>
+          </w:tcPr>
+          <w:p>
+            <w:pPr>
+              <w:spacing w:after="0" w:line="216" w:lineRule="auto"/>
               <w:ind w:left="780" w:hanging="780"/>
               <w:jc w:val="center"/>
               <w:textAlignment w:val="baseline"/>
@@ -3451,24 +3489,24 @@
         </w:tc>
         <w:tc>
           <w:tcPr>
-            <w:tcW w:w="1132" w:type="dxa"/>
-            <w:tcBorders>
-              <w:top w:val="single" w:sz="2" w:space="0" w:color="000000"/>
-              <w:left w:val="single" w:sz="2" w:space="0" w:color="000000"/>
-              <w:bottom w:val="single" w:sz="2" w:space="0" w:color="000000"/>
-              <w:right w:val="single" w:sz="2" w:space="0" w:color="000000"/>
-            </w:tcBorders>
-            <w:tcMar>
-              <w:top w:w="28" w:type="dxa"/>
-              <w:left w:w="102" w:type="dxa"/>
-              <w:bottom w:w="28" w:type="dxa"/>
-              <w:right w:w="102" w:type="dxa"/>
-            </w:tcMar>
-            <w:vAlign w:val="center"/>
-          </w:tcPr>
-          <w:p>
-            <w:pPr>
-              <w:spacing w:after="0" w:line="360" w:lineRule="auto"/>
+            <w:tcW w:w="1021" w:type="dxa"/>
+            <w:tcBorders>
+              <w:top w:val="single" w:sz="2" w:space="0" w:color="000000"/>
+              <w:left w:val="single" w:sz="2" w:space="0" w:color="000000"/>
+              <w:bottom w:val="single" w:sz="2" w:space="0" w:color="000000"/>
+              <w:right w:val="single" w:sz="2" w:space="0" w:color="000000"/>
+            </w:tcBorders>
+            <w:tcMar>
+              <w:top w:w="28" w:type="dxa"/>
+              <w:left w:w="102" w:type="dxa"/>
+              <w:bottom w:w="28" w:type="dxa"/>
+              <w:right w:w="102" w:type="dxa"/>
+            </w:tcMar>
+            <w:vAlign w:val="center"/>
+          </w:tcPr>
+          <w:p>
+            <w:pPr>
+              <w:spacing w:after="0" w:line="216" w:lineRule="auto"/>
               <w:ind w:left="780" w:hanging="780"/>
               <w:jc w:val="center"/>
               <w:textAlignment w:val="baseline"/>
@@ -3490,7 +3528,7 @@
         </w:trPr>
         <w:tc>
           <w:tcPr>
-            <w:tcW w:w="829" w:type="dxa"/>
+            <w:tcW w:w="1418" w:type="dxa"/>
             <w:tcBorders>
               <w:top w:val="single" w:sz="2" w:space="0" w:color="000000"/>
               <w:left w:val="single" w:sz="2" w:space="0" w:color="000000"/>
@@ -3511,7 +3549,7 @@
               <w:wordWrap/>
               <w:autoSpaceDE/>
               <w:autoSpaceDN/>
-              <w:spacing w:line="340" w:lineRule="exact"/>
+              <w:spacing w:line="216" w:lineRule="auto"/>
               <w:jc w:val="center"/>
               <w:rPr>
                 <w:rFonts w:hAnsi="함초롬바탕" w:cs="함초롬바탕"/>
@@ -3524,7 +3562,7 @@
         </w:tc>
         <w:tc>
           <w:tcPr>
-            <w:tcW w:w="0" w:type="auto"/>
+            <w:tcW w:w="1021" w:type="dxa"/>
             <w:tcBorders>
               <w:top w:val="single" w:sz="2" w:space="0" w:color="000000"/>
               <w:left w:val="single" w:sz="2" w:space="0" w:color="000000"/>
@@ -3545,7 +3583,7 @@
               <w:wordWrap/>
               <w:autoSpaceDE/>
               <w:autoSpaceDN/>
-              <w:spacing w:line="340" w:lineRule="exact"/>
+              <w:spacing w:line="216" w:lineRule="auto"/>
               <w:jc w:val="center"/>
               <w:rPr>
                 <w:rFonts w:hAnsi="함초롬바탕" w:cs="함초롬바탕"/>
@@ -3558,7 +3596,7 @@
         </w:tc>
         <w:tc>
           <w:tcPr>
-            <w:tcW w:w="0" w:type="auto"/>
+            <w:tcW w:w="1021" w:type="dxa"/>
             <w:tcBorders>
               <w:top w:val="single" w:sz="2" w:space="0" w:color="000000"/>
               <w:left w:val="single" w:sz="2" w:space="0" w:color="000000"/>
@@ -3579,7 +3617,7 @@
               <w:wordWrap/>
               <w:autoSpaceDE/>
               <w:autoSpaceDN/>
-              <w:spacing w:line="340" w:lineRule="exact"/>
+              <w:spacing w:line="216" w:lineRule="auto"/>
               <w:jc w:val="center"/>
               <w:rPr>
                 <w:rFonts w:hAnsi="함초롬바탕" w:cs="함초롬바탕"/>
@@ -3592,7 +3630,7 @@
         </w:tc>
         <w:tc>
           <w:tcPr>
-            <w:tcW w:w="0" w:type="auto"/>
+            <w:tcW w:w="1021" w:type="dxa"/>
             <w:tcBorders>
               <w:top w:val="single" w:sz="2" w:space="0" w:color="000000"/>
               <w:left w:val="single" w:sz="2" w:space="0" w:color="000000"/>
@@ -3613,7 +3651,7 @@
               <w:wordWrap/>
               <w:autoSpaceDE/>
               <w:autoSpaceDN/>
-              <w:spacing w:line="340" w:lineRule="exact"/>
+              <w:spacing w:line="216" w:lineRule="auto"/>
               <w:jc w:val="center"/>
               <w:rPr>
                 <w:rFonts w:hAnsi="함초롬바탕" w:cs="함초롬바탕"/>
@@ -3626,24 +3664,24 @@
         </w:tc>
         <w:tc>
           <w:tcPr>
-            <w:tcW w:w="0" w:type="auto"/>
-            <w:tcBorders>
-              <w:top w:val="single" w:sz="2" w:space="0" w:color="000000"/>
-              <w:left w:val="single" w:sz="2" w:space="0" w:color="000000"/>
-              <w:bottom w:val="single" w:sz="2" w:space="0" w:color="000000"/>
-              <w:right w:val="single" w:sz="2" w:space="0" w:color="000000"/>
-            </w:tcBorders>
-            <w:tcMar>
-              <w:top w:w="28" w:type="dxa"/>
-              <w:left w:w="102" w:type="dxa"/>
-              <w:bottom w:w="28" w:type="dxa"/>
-              <w:right w:w="102" w:type="dxa"/>
-            </w:tcMar>
-            <w:vAlign w:val="center"/>
-          </w:tcPr>
-          <w:p>
-            <w:pPr>
-              <w:spacing w:after="0" w:line="360" w:lineRule="auto"/>
+            <w:tcW w:w="1021" w:type="dxa"/>
+            <w:tcBorders>
+              <w:top w:val="single" w:sz="2" w:space="0" w:color="000000"/>
+              <w:left w:val="single" w:sz="2" w:space="0" w:color="000000"/>
+              <w:bottom w:val="single" w:sz="2" w:space="0" w:color="000000"/>
+              <w:right w:val="single" w:sz="2" w:space="0" w:color="000000"/>
+            </w:tcBorders>
+            <w:tcMar>
+              <w:top w:w="28" w:type="dxa"/>
+              <w:left w:w="102" w:type="dxa"/>
+              <w:bottom w:w="28" w:type="dxa"/>
+              <w:right w:w="102" w:type="dxa"/>
+            </w:tcMar>
+            <w:vAlign w:val="center"/>
+          </w:tcPr>
+          <w:p>
+            <w:pPr>
+              <w:spacing w:after="0" w:line="216" w:lineRule="auto"/>
               <w:ind w:left="780" w:hanging="780"/>
               <w:jc w:val="center"/>
               <w:textAlignment w:val="baseline"/>
@@ -3661,24 +3699,24 @@
         </w:tc>
         <w:tc>
           <w:tcPr>
-            <w:tcW w:w="0" w:type="auto"/>
-            <w:tcBorders>
-              <w:top w:val="single" w:sz="2" w:space="0" w:color="000000"/>
-              <w:left w:val="single" w:sz="2" w:space="0" w:color="000000"/>
-              <w:bottom w:val="single" w:sz="2" w:space="0" w:color="000000"/>
-              <w:right w:val="single" w:sz="2" w:space="0" w:color="000000"/>
-            </w:tcBorders>
-            <w:tcMar>
-              <w:top w:w="28" w:type="dxa"/>
-              <w:left w:w="102" w:type="dxa"/>
-              <w:bottom w:w="28" w:type="dxa"/>
-              <w:right w:w="102" w:type="dxa"/>
-            </w:tcMar>
-            <w:vAlign w:val="center"/>
-          </w:tcPr>
-          <w:p>
-            <w:pPr>
-              <w:spacing w:after="0" w:line="360" w:lineRule="auto"/>
+            <w:tcW w:w="1021" w:type="dxa"/>
+            <w:tcBorders>
+              <w:top w:val="single" w:sz="2" w:space="0" w:color="000000"/>
+              <w:left w:val="single" w:sz="2" w:space="0" w:color="000000"/>
+              <w:bottom w:val="single" w:sz="2" w:space="0" w:color="000000"/>
+              <w:right w:val="single" w:sz="2" w:space="0" w:color="000000"/>
+            </w:tcBorders>
+            <w:tcMar>
+              <w:top w:w="28" w:type="dxa"/>
+              <w:left w:w="102" w:type="dxa"/>
+              <w:bottom w:w="28" w:type="dxa"/>
+              <w:right w:w="102" w:type="dxa"/>
+            </w:tcMar>
+            <w:vAlign w:val="center"/>
+          </w:tcPr>
+          <w:p>
+            <w:pPr>
+              <w:spacing w:after="0" w:line="216" w:lineRule="auto"/>
               <w:ind w:left="780" w:hanging="780"/>
               <w:jc w:val="center"/>
               <w:textAlignment w:val="baseline"/>
@@ -3696,24 +3734,24 @@
         </w:tc>
         <w:tc>
           <w:tcPr>
-            <w:tcW w:w="0" w:type="auto"/>
-            <w:tcBorders>
-              <w:top w:val="single" w:sz="2" w:space="0" w:color="000000"/>
-              <w:left w:val="single" w:sz="2" w:space="0" w:color="000000"/>
-              <w:bottom w:val="single" w:sz="2" w:space="0" w:color="000000"/>
-              <w:right w:val="single" w:sz="2" w:space="0" w:color="000000"/>
-            </w:tcBorders>
-            <w:tcMar>
-              <w:top w:w="28" w:type="dxa"/>
-              <w:left w:w="102" w:type="dxa"/>
-              <w:bottom w:w="28" w:type="dxa"/>
-              <w:right w:w="102" w:type="dxa"/>
-            </w:tcMar>
-            <w:vAlign w:val="center"/>
-          </w:tcPr>
-          <w:p>
-            <w:pPr>
-              <w:spacing w:after="0" w:line="360" w:lineRule="auto"/>
+            <w:tcW w:w="1021" w:type="dxa"/>
+            <w:tcBorders>
+              <w:top w:val="single" w:sz="2" w:space="0" w:color="000000"/>
+              <w:left w:val="single" w:sz="2" w:space="0" w:color="000000"/>
+              <w:bottom w:val="single" w:sz="2" w:space="0" w:color="000000"/>
+              <w:right w:val="single" w:sz="2" w:space="0" w:color="000000"/>
+            </w:tcBorders>
+            <w:tcMar>
+              <w:top w:w="28" w:type="dxa"/>
+              <w:left w:w="102" w:type="dxa"/>
+              <w:bottom w:w="28" w:type="dxa"/>
+              <w:right w:w="102" w:type="dxa"/>
+            </w:tcMar>
+            <w:vAlign w:val="center"/>
+          </w:tcPr>
+          <w:p>
+            <w:pPr>
+              <w:spacing w:after="0" w:line="216" w:lineRule="auto"/>
               <w:ind w:left="780" w:hanging="780"/>
               <w:jc w:val="center"/>
               <w:textAlignment w:val="baseline"/>
@@ -3731,24 +3769,24 @@
         </w:tc>
         <w:tc>
           <w:tcPr>
-            <w:tcW w:w="0" w:type="auto"/>
-            <w:tcBorders>
-              <w:top w:val="single" w:sz="2" w:space="0" w:color="000000"/>
-              <w:left w:val="single" w:sz="2" w:space="0" w:color="000000"/>
-              <w:bottom w:val="single" w:sz="2" w:space="0" w:color="000000"/>
-              <w:right w:val="single" w:sz="2" w:space="0" w:color="000000"/>
-            </w:tcBorders>
-            <w:tcMar>
-              <w:top w:w="28" w:type="dxa"/>
-              <w:left w:w="102" w:type="dxa"/>
-              <w:bottom w:w="28" w:type="dxa"/>
-              <w:right w:w="102" w:type="dxa"/>
-            </w:tcMar>
-            <w:vAlign w:val="center"/>
-          </w:tcPr>
-          <w:p>
-            <w:pPr>
-              <w:spacing w:after="0" w:line="360" w:lineRule="auto"/>
+            <w:tcW w:w="1021" w:type="dxa"/>
+            <w:tcBorders>
+              <w:top w:val="single" w:sz="2" w:space="0" w:color="000000"/>
+              <w:left w:val="single" w:sz="2" w:space="0" w:color="000000"/>
+              <w:bottom w:val="single" w:sz="2" w:space="0" w:color="000000"/>
+              <w:right w:val="single" w:sz="2" w:space="0" w:color="000000"/>
+            </w:tcBorders>
+            <w:tcMar>
+              <w:top w:w="28" w:type="dxa"/>
+              <w:left w:w="102" w:type="dxa"/>
+              <w:bottom w:w="28" w:type="dxa"/>
+              <w:right w:w="102" w:type="dxa"/>
+            </w:tcMar>
+            <w:vAlign w:val="center"/>
+          </w:tcPr>
+          <w:p>
+            <w:pPr>
+              <w:spacing w:after="0" w:line="216" w:lineRule="auto"/>
               <w:ind w:left="780" w:hanging="780"/>
               <w:jc w:val="center"/>
               <w:textAlignment w:val="baseline"/>
@@ -3766,24 +3804,24 @@
         </w:tc>
         <w:tc>
           <w:tcPr>
-            <w:tcW w:w="0" w:type="auto"/>
-            <w:tcBorders>
-              <w:top w:val="single" w:sz="2" w:space="0" w:color="000000"/>
-              <w:left w:val="single" w:sz="2" w:space="0" w:color="000000"/>
-              <w:bottom w:val="single" w:sz="2" w:space="0" w:color="000000"/>
-              <w:right w:val="single" w:sz="2" w:space="0" w:color="000000"/>
-            </w:tcBorders>
-            <w:tcMar>
-              <w:top w:w="28" w:type="dxa"/>
-              <w:left w:w="102" w:type="dxa"/>
-              <w:bottom w:w="28" w:type="dxa"/>
-              <w:right w:w="102" w:type="dxa"/>
-            </w:tcMar>
-            <w:vAlign w:val="center"/>
-          </w:tcPr>
-          <w:p>
-            <w:pPr>
-              <w:spacing w:after="0" w:line="360" w:lineRule="auto"/>
+            <w:tcW w:w="1021" w:type="dxa"/>
+            <w:tcBorders>
+              <w:top w:val="single" w:sz="2" w:space="0" w:color="000000"/>
+              <w:left w:val="single" w:sz="2" w:space="0" w:color="000000"/>
+              <w:bottom w:val="single" w:sz="2" w:space="0" w:color="000000"/>
+              <w:right w:val="single" w:sz="2" w:space="0" w:color="000000"/>
+            </w:tcBorders>
+            <w:tcMar>
+              <w:top w:w="28" w:type="dxa"/>
+              <w:left w:w="102" w:type="dxa"/>
+              <w:bottom w:w="28" w:type="dxa"/>
+              <w:right w:w="102" w:type="dxa"/>
+            </w:tcMar>
+            <w:vAlign w:val="center"/>
+          </w:tcPr>
+          <w:p>
+            <w:pPr>
+              <w:spacing w:after="0" w:line="216" w:lineRule="auto"/>
               <w:ind w:left="780" w:hanging="780"/>
               <w:jc w:val="center"/>
               <w:textAlignment w:val="baseline"/>
@@ -3801,24 +3839,24 @@
         </w:tc>
         <w:tc>
           <w:tcPr>
-            <w:tcW w:w="0" w:type="auto"/>
-            <w:tcBorders>
-              <w:top w:val="single" w:sz="2" w:space="0" w:color="000000"/>
-              <w:left w:val="single" w:sz="2" w:space="0" w:color="000000"/>
-              <w:bottom w:val="single" w:sz="2" w:space="0" w:color="000000"/>
-              <w:right w:val="single" w:sz="2" w:space="0" w:color="000000"/>
-            </w:tcBorders>
-            <w:tcMar>
-              <w:top w:w="28" w:type="dxa"/>
-              <w:left w:w="102" w:type="dxa"/>
-              <w:bottom w:w="28" w:type="dxa"/>
-              <w:right w:w="102" w:type="dxa"/>
-            </w:tcMar>
-            <w:vAlign w:val="center"/>
-          </w:tcPr>
-          <w:p>
-            <w:pPr>
-              <w:spacing w:after="0" w:line="360" w:lineRule="auto"/>
+            <w:tcW w:w="1021" w:type="dxa"/>
+            <w:tcBorders>
+              <w:top w:val="single" w:sz="2" w:space="0" w:color="000000"/>
+              <w:left w:val="single" w:sz="2" w:space="0" w:color="000000"/>
+              <w:bottom w:val="single" w:sz="2" w:space="0" w:color="000000"/>
+              <w:right w:val="single" w:sz="2" w:space="0" w:color="000000"/>
+            </w:tcBorders>
+            <w:tcMar>
+              <w:top w:w="28" w:type="dxa"/>
+              <w:left w:w="102" w:type="dxa"/>
+              <w:bottom w:w="28" w:type="dxa"/>
+              <w:right w:w="102" w:type="dxa"/>
+            </w:tcMar>
+            <w:vAlign w:val="center"/>
+          </w:tcPr>
+          <w:p>
+            <w:pPr>
+              <w:spacing w:after="0" w:line="216" w:lineRule="auto"/>
               <w:ind w:left="780" w:hanging="780"/>
               <w:jc w:val="center"/>
               <w:textAlignment w:val="baseline"/>
@@ -3836,24 +3874,24 @@
         </w:tc>
         <w:tc>
           <w:tcPr>
-            <w:tcW w:w="1132" w:type="dxa"/>
-            <w:tcBorders>
-              <w:top w:val="single" w:sz="2" w:space="0" w:color="000000"/>
-              <w:left w:val="single" w:sz="2" w:space="0" w:color="000000"/>
-              <w:bottom w:val="single" w:sz="2" w:space="0" w:color="000000"/>
-              <w:right w:val="single" w:sz="2" w:space="0" w:color="000000"/>
-            </w:tcBorders>
-            <w:tcMar>
-              <w:top w:w="28" w:type="dxa"/>
-              <w:left w:w="102" w:type="dxa"/>
-              <w:bottom w:w="28" w:type="dxa"/>
-              <w:right w:w="102" w:type="dxa"/>
-            </w:tcMar>
-            <w:vAlign w:val="center"/>
-          </w:tcPr>
-          <w:p>
-            <w:pPr>
-              <w:spacing w:after="0" w:line="360" w:lineRule="auto"/>
+            <w:tcW w:w="1021" w:type="dxa"/>
+            <w:tcBorders>
+              <w:top w:val="single" w:sz="2" w:space="0" w:color="000000"/>
+              <w:left w:val="single" w:sz="2" w:space="0" w:color="000000"/>
+              <w:bottom w:val="single" w:sz="2" w:space="0" w:color="000000"/>
+              <w:right w:val="single" w:sz="2" w:space="0" w:color="000000"/>
+            </w:tcBorders>
+            <w:tcMar>
+              <w:top w:w="28" w:type="dxa"/>
+              <w:left w:w="102" w:type="dxa"/>
+              <w:bottom w:w="28" w:type="dxa"/>
+              <w:right w:w="102" w:type="dxa"/>
+            </w:tcMar>
+            <w:vAlign w:val="center"/>
+          </w:tcPr>
+          <w:p>
+            <w:pPr>
+              <w:spacing w:after="0" w:line="216" w:lineRule="auto"/>
               <w:ind w:left="780" w:hanging="780"/>
               <w:jc w:val="center"/>
               <w:textAlignment w:val="baseline"/>
@@ -3876,7 +3914,7 @@
         </w:trPr>
         <w:tc>
           <w:tcPr>
-            <w:tcW w:w="829" w:type="dxa"/>
+            <w:tcW w:w="1418" w:type="dxa"/>
             <w:tcBorders>
               <w:top w:val="single" w:sz="2" w:space="0" w:color="000000"/>
               <w:left w:val="single" w:sz="2" w:space="0" w:color="000000"/>
@@ -3897,7 +3935,7 @@
               <w:wordWrap/>
               <w:autoSpaceDE/>
               <w:autoSpaceDN/>
-              <w:spacing w:line="340" w:lineRule="exact"/>
+              <w:spacing w:line="216" w:lineRule="auto"/>
               <w:jc w:val="center"/>
               <w:rPr>
                 <w:rFonts w:hAnsi="함초롬바탕" w:cs="함초롬바탕"/>
@@ -3910,7 +3948,7 @@
         </w:tc>
         <w:tc>
           <w:tcPr>
-            <w:tcW w:w="0" w:type="auto"/>
+            <w:tcW w:w="1021" w:type="dxa"/>
             <w:tcBorders>
               <w:top w:val="single" w:sz="2" w:space="0" w:color="000000"/>
               <w:left w:val="single" w:sz="2" w:space="0" w:color="000000"/>
@@ -3931,7 +3969,7 @@
               <w:wordWrap/>
               <w:autoSpaceDE/>
               <w:autoSpaceDN/>
-              <w:spacing w:line="340" w:lineRule="exact"/>
+              <w:spacing w:line="216" w:lineRule="auto"/>
               <w:jc w:val="center"/>
               <w:rPr>
                 <w:rFonts w:hAnsi="함초롬바탕" w:cs="함초롬바탕"/>
@@ -3944,7 +3982,7 @@
         </w:tc>
         <w:tc>
           <w:tcPr>
-            <w:tcW w:w="0" w:type="auto"/>
+            <w:tcW w:w="1021" w:type="dxa"/>
             <w:tcBorders>
               <w:top w:val="single" w:sz="2" w:space="0" w:color="000000"/>
               <w:left w:val="single" w:sz="2" w:space="0" w:color="000000"/>
@@ -3965,7 +4003,7 @@
               <w:wordWrap/>
               <w:autoSpaceDE/>
               <w:autoSpaceDN/>
-              <w:spacing w:line="340" w:lineRule="exact"/>
+              <w:spacing w:line="216" w:lineRule="auto"/>
               <w:jc w:val="center"/>
               <w:rPr>
                 <w:rFonts w:hAnsi="함초롬바탕" w:cs="함초롬바탕"/>
@@ -3978,7 +4016,7 @@
         </w:tc>
         <w:tc>
           <w:tcPr>
-            <w:tcW w:w="0" w:type="auto"/>
+            <w:tcW w:w="1021" w:type="dxa"/>
             <w:tcBorders>
               <w:top w:val="single" w:sz="2" w:space="0" w:color="000000"/>
               <w:left w:val="single" w:sz="2" w:space="0" w:color="000000"/>
@@ -3999,7 +4037,7 @@
               <w:wordWrap/>
               <w:autoSpaceDE/>
               <w:autoSpaceDN/>
-              <w:spacing w:line="340" w:lineRule="exact"/>
+              <w:spacing w:line="216" w:lineRule="auto"/>
               <w:jc w:val="center"/>
               <w:rPr>
                 <w:rFonts w:hAnsi="함초롬바탕" w:cs="함초롬바탕"/>
@@ -4012,24 +4050,24 @@
         </w:tc>
         <w:tc>
           <w:tcPr>
-            <w:tcW w:w="0" w:type="auto"/>
-            <w:tcBorders>
-              <w:top w:val="single" w:sz="2" w:space="0" w:color="000000"/>
-              <w:left w:val="single" w:sz="2" w:space="0" w:color="000000"/>
-              <w:bottom w:val="single" w:sz="2" w:space="0" w:color="000000"/>
-              <w:right w:val="single" w:sz="2" w:space="0" w:color="000000"/>
-            </w:tcBorders>
-            <w:tcMar>
-              <w:top w:w="28" w:type="dxa"/>
-              <w:left w:w="102" w:type="dxa"/>
-              <w:bottom w:w="28" w:type="dxa"/>
-              <w:right w:w="102" w:type="dxa"/>
-            </w:tcMar>
-            <w:vAlign w:val="center"/>
-          </w:tcPr>
-          <w:p>
-            <w:pPr>
-              <w:spacing w:after="0" w:line="360" w:lineRule="auto"/>
+            <w:tcW w:w="1021" w:type="dxa"/>
+            <w:tcBorders>
+              <w:top w:val="single" w:sz="2" w:space="0" w:color="000000"/>
+              <w:left w:val="single" w:sz="2" w:space="0" w:color="000000"/>
+              <w:bottom w:val="single" w:sz="2" w:space="0" w:color="000000"/>
+              <w:right w:val="single" w:sz="2" w:space="0" w:color="000000"/>
+            </w:tcBorders>
+            <w:tcMar>
+              <w:top w:w="28" w:type="dxa"/>
+              <w:left w:w="102" w:type="dxa"/>
+              <w:bottom w:w="28" w:type="dxa"/>
+              <w:right w:w="102" w:type="dxa"/>
+            </w:tcMar>
+            <w:vAlign w:val="center"/>
+          </w:tcPr>
+          <w:p>
+            <w:pPr>
+              <w:spacing w:after="0" w:line="216" w:lineRule="auto"/>
               <w:ind w:left="780" w:hanging="780"/>
               <w:jc w:val="center"/>
               <w:textAlignment w:val="baseline"/>
@@ -4047,24 +4085,24 @@
         </w:tc>
         <w:tc>
           <w:tcPr>
-            <w:tcW w:w="0" w:type="auto"/>
-            <w:tcBorders>
-              <w:top w:val="single" w:sz="2" w:space="0" w:color="000000"/>
-              <w:left w:val="single" w:sz="2" w:space="0" w:color="000000"/>
-              <w:bottom w:val="single" w:sz="2" w:space="0" w:color="000000"/>
-              <w:right w:val="single" w:sz="2" w:space="0" w:color="000000"/>
-            </w:tcBorders>
-            <w:tcMar>
-              <w:top w:w="28" w:type="dxa"/>
-              <w:left w:w="102" w:type="dxa"/>
-              <w:bottom w:w="28" w:type="dxa"/>
-              <w:right w:w="102" w:type="dxa"/>
-            </w:tcMar>
-            <w:vAlign w:val="center"/>
-          </w:tcPr>
-          <w:p>
-            <w:pPr>
-              <w:spacing w:after="0" w:line="360" w:lineRule="auto"/>
+            <w:tcW w:w="1021" w:type="dxa"/>
+            <w:tcBorders>
+              <w:top w:val="single" w:sz="2" w:space="0" w:color="000000"/>
+              <w:left w:val="single" w:sz="2" w:space="0" w:color="000000"/>
+              <w:bottom w:val="single" w:sz="2" w:space="0" w:color="000000"/>
+              <w:right w:val="single" w:sz="2" w:space="0" w:color="000000"/>
+            </w:tcBorders>
+            <w:tcMar>
+              <w:top w:w="28" w:type="dxa"/>
+              <w:left w:w="102" w:type="dxa"/>
+              <w:bottom w:w="28" w:type="dxa"/>
+              <w:right w:w="102" w:type="dxa"/>
+            </w:tcMar>
+            <w:vAlign w:val="center"/>
+          </w:tcPr>
+          <w:p>
+            <w:pPr>
+              <w:spacing w:after="0" w:line="216" w:lineRule="auto"/>
               <w:ind w:left="780" w:hanging="780"/>
               <w:jc w:val="center"/>
               <w:textAlignment w:val="baseline"/>
@@ -4082,24 +4120,24 @@
         </w:tc>
         <w:tc>
           <w:tcPr>
-            <w:tcW w:w="0" w:type="auto"/>
-            <w:tcBorders>
-              <w:top w:val="single" w:sz="2" w:space="0" w:color="000000"/>
-              <w:left w:val="single" w:sz="2" w:space="0" w:color="000000"/>
-              <w:bottom w:val="single" w:sz="2" w:space="0" w:color="000000"/>
-              <w:right w:val="single" w:sz="2" w:space="0" w:color="000000"/>
-            </w:tcBorders>
-            <w:tcMar>
-              <w:top w:w="28" w:type="dxa"/>
-              <w:left w:w="102" w:type="dxa"/>
-              <w:bottom w:w="28" w:type="dxa"/>
-              <w:right w:w="102" w:type="dxa"/>
-            </w:tcMar>
-            <w:vAlign w:val="center"/>
-          </w:tcPr>
-          <w:p>
-            <w:pPr>
-              <w:spacing w:after="0" w:line="360" w:lineRule="auto"/>
+            <w:tcW w:w="1021" w:type="dxa"/>
+            <w:tcBorders>
+              <w:top w:val="single" w:sz="2" w:space="0" w:color="000000"/>
+              <w:left w:val="single" w:sz="2" w:space="0" w:color="000000"/>
+              <w:bottom w:val="single" w:sz="2" w:space="0" w:color="000000"/>
+              <w:right w:val="single" w:sz="2" w:space="0" w:color="000000"/>
+            </w:tcBorders>
+            <w:tcMar>
+              <w:top w:w="28" w:type="dxa"/>
+              <w:left w:w="102" w:type="dxa"/>
+              <w:bottom w:w="28" w:type="dxa"/>
+              <w:right w:w="102" w:type="dxa"/>
+            </w:tcMar>
+            <w:vAlign w:val="center"/>
+          </w:tcPr>
+          <w:p>
+            <w:pPr>
+              <w:spacing w:after="0" w:line="216" w:lineRule="auto"/>
               <w:ind w:left="780" w:hanging="780"/>
               <w:jc w:val="center"/>
               <w:textAlignment w:val="baseline"/>
@@ -4117,24 +4155,24 @@
         </w:tc>
         <w:tc>
           <w:tcPr>
-            <w:tcW w:w="0" w:type="auto"/>
-            <w:tcBorders>
-              <w:top w:val="single" w:sz="2" w:space="0" w:color="000000"/>
-              <w:left w:val="single" w:sz="2" w:space="0" w:color="000000"/>
-              <w:bottom w:val="single" w:sz="2" w:space="0" w:color="000000"/>
-              <w:right w:val="single" w:sz="2" w:space="0" w:color="000000"/>
-            </w:tcBorders>
-            <w:tcMar>
-              <w:top w:w="28" w:type="dxa"/>
-              <w:left w:w="102" w:type="dxa"/>
-              <w:bottom w:w="28" w:type="dxa"/>
-              <w:right w:w="102" w:type="dxa"/>
-            </w:tcMar>
-            <w:vAlign w:val="center"/>
-          </w:tcPr>
-          <w:p>
-            <w:pPr>
-              <w:spacing w:after="0" w:line="360" w:lineRule="auto"/>
+            <w:tcW w:w="1021" w:type="dxa"/>
+            <w:tcBorders>
+              <w:top w:val="single" w:sz="2" w:space="0" w:color="000000"/>
+              <w:left w:val="single" w:sz="2" w:space="0" w:color="000000"/>
+              <w:bottom w:val="single" w:sz="2" w:space="0" w:color="000000"/>
+              <w:right w:val="single" w:sz="2" w:space="0" w:color="000000"/>
+            </w:tcBorders>
+            <w:tcMar>
+              <w:top w:w="28" w:type="dxa"/>
+              <w:left w:w="102" w:type="dxa"/>
+              <w:bottom w:w="28" w:type="dxa"/>
+              <w:right w:w="102" w:type="dxa"/>
+            </w:tcMar>
+            <w:vAlign w:val="center"/>
+          </w:tcPr>
+          <w:p>
+            <w:pPr>
+              <w:spacing w:after="0" w:line="216" w:lineRule="auto"/>
               <w:ind w:left="780" w:hanging="780"/>
               <w:jc w:val="center"/>
               <w:textAlignment w:val="baseline"/>
@@ -4152,24 +4190,24 @@
         </w:tc>
         <w:tc>
           <w:tcPr>
-            <w:tcW w:w="0" w:type="auto"/>
-            <w:tcBorders>
-              <w:top w:val="single" w:sz="2" w:space="0" w:color="000000"/>
-              <w:left w:val="single" w:sz="2" w:space="0" w:color="000000"/>
-              <w:bottom w:val="single" w:sz="2" w:space="0" w:color="000000"/>
-              <w:right w:val="single" w:sz="2" w:space="0" w:color="000000"/>
-            </w:tcBorders>
-            <w:tcMar>
-              <w:top w:w="28" w:type="dxa"/>
-              <w:left w:w="102" w:type="dxa"/>
-              <w:bottom w:w="28" w:type="dxa"/>
-              <w:right w:w="102" w:type="dxa"/>
-            </w:tcMar>
-            <w:vAlign w:val="center"/>
-          </w:tcPr>
-          <w:p>
-            <w:pPr>
-              <w:spacing w:after="0" w:line="360" w:lineRule="auto"/>
+            <w:tcW w:w="1021" w:type="dxa"/>
+            <w:tcBorders>
+              <w:top w:val="single" w:sz="2" w:space="0" w:color="000000"/>
+              <w:left w:val="single" w:sz="2" w:space="0" w:color="000000"/>
+              <w:bottom w:val="single" w:sz="2" w:space="0" w:color="000000"/>
+              <w:right w:val="single" w:sz="2" w:space="0" w:color="000000"/>
+            </w:tcBorders>
+            <w:tcMar>
+              <w:top w:w="28" w:type="dxa"/>
+              <w:left w:w="102" w:type="dxa"/>
+              <w:bottom w:w="28" w:type="dxa"/>
+              <w:right w:w="102" w:type="dxa"/>
+            </w:tcMar>
+            <w:vAlign w:val="center"/>
+          </w:tcPr>
+          <w:p>
+            <w:pPr>
+              <w:spacing w:after="0" w:line="216" w:lineRule="auto"/>
               <w:ind w:left="780" w:hanging="780"/>
               <w:jc w:val="center"/>
               <w:textAlignment w:val="baseline"/>
@@ -4187,24 +4225,24 @@
         </w:tc>
         <w:tc>
           <w:tcPr>
-            <w:tcW w:w="0" w:type="auto"/>
-            <w:tcBorders>
-              <w:top w:val="single" w:sz="2" w:space="0" w:color="000000"/>
-              <w:left w:val="single" w:sz="2" w:space="0" w:color="000000"/>
-              <w:bottom w:val="single" w:sz="2" w:space="0" w:color="000000"/>
-              <w:right w:val="single" w:sz="2" w:space="0" w:color="000000"/>
-            </w:tcBorders>
-            <w:tcMar>
-              <w:top w:w="28" w:type="dxa"/>
-              <w:left w:w="102" w:type="dxa"/>
-              <w:bottom w:w="28" w:type="dxa"/>
-              <w:right w:w="102" w:type="dxa"/>
-            </w:tcMar>
-            <w:vAlign w:val="center"/>
-          </w:tcPr>
-          <w:p>
-            <w:pPr>
-              <w:spacing w:after="0" w:line="360" w:lineRule="auto"/>
+            <w:tcW w:w="1021" w:type="dxa"/>
+            <w:tcBorders>
+              <w:top w:val="single" w:sz="2" w:space="0" w:color="000000"/>
+              <w:left w:val="single" w:sz="2" w:space="0" w:color="000000"/>
+              <w:bottom w:val="single" w:sz="2" w:space="0" w:color="000000"/>
+              <w:right w:val="single" w:sz="2" w:space="0" w:color="000000"/>
+            </w:tcBorders>
+            <w:tcMar>
+              <w:top w:w="28" w:type="dxa"/>
+              <w:left w:w="102" w:type="dxa"/>
+              <w:bottom w:w="28" w:type="dxa"/>
+              <w:right w:w="102" w:type="dxa"/>
+            </w:tcMar>
+            <w:vAlign w:val="center"/>
+          </w:tcPr>
+          <w:p>
+            <w:pPr>
+              <w:spacing w:after="0" w:line="216" w:lineRule="auto"/>
               <w:ind w:left="780" w:hanging="780"/>
               <w:jc w:val="center"/>
               <w:textAlignment w:val="baseline"/>
@@ -4222,24 +4260,24 @@
         </w:tc>
         <w:tc>
           <w:tcPr>
-            <w:tcW w:w="1132" w:type="dxa"/>
-            <w:tcBorders>
-              <w:top w:val="single" w:sz="2" w:space="0" w:color="000000"/>
-              <w:left w:val="single" w:sz="2" w:space="0" w:color="000000"/>
-              <w:bottom w:val="single" w:sz="2" w:space="0" w:color="000000"/>
-              <w:right w:val="single" w:sz="2" w:space="0" w:color="000000"/>
-            </w:tcBorders>
-            <w:tcMar>
-              <w:top w:w="28" w:type="dxa"/>
-              <w:left w:w="102" w:type="dxa"/>
-              <w:bottom w:w="28" w:type="dxa"/>
-              <w:right w:w="102" w:type="dxa"/>
-            </w:tcMar>
-            <w:vAlign w:val="center"/>
-          </w:tcPr>
-          <w:p>
-            <w:pPr>
-              <w:spacing w:after="0" w:line="360" w:lineRule="auto"/>
+            <w:tcW w:w="1021" w:type="dxa"/>
+            <w:tcBorders>
+              <w:top w:val="single" w:sz="2" w:space="0" w:color="000000"/>
+              <w:left w:val="single" w:sz="2" w:space="0" w:color="000000"/>
+              <w:bottom w:val="single" w:sz="2" w:space="0" w:color="000000"/>
+              <w:right w:val="single" w:sz="2" w:space="0" w:color="000000"/>
+            </w:tcBorders>
+            <w:tcMar>
+              <w:top w:w="28" w:type="dxa"/>
+              <w:left w:w="102" w:type="dxa"/>
+              <w:bottom w:w="28" w:type="dxa"/>
+              <w:right w:w="102" w:type="dxa"/>
+            </w:tcMar>
+            <w:vAlign w:val="center"/>
+          </w:tcPr>
+          <w:p>
+            <w:pPr>
+              <w:spacing w:after="0" w:line="216" w:lineRule="auto"/>
               <w:ind w:left="780" w:hanging="780"/>
               <w:jc w:val="center"/>
               <w:textAlignment w:val="baseline"/>
@@ -4262,7 +4300,7 @@
         </w:trPr>
         <w:tc>
           <w:tcPr>
-            <w:tcW w:w="829" w:type="dxa"/>
+            <w:tcW w:w="1418" w:type="dxa"/>
             <w:tcBorders>
               <w:top w:val="single" w:sz="2" w:space="0" w:color="000000"/>
               <w:left w:val="single" w:sz="2" w:space="0" w:color="000000"/>
@@ -4283,7 +4321,7 @@
               <w:wordWrap/>
               <w:autoSpaceDE/>
               <w:autoSpaceDN/>
-              <w:spacing w:line="340" w:lineRule="exact"/>
+              <w:spacing w:line="216" w:lineRule="auto"/>
               <w:jc w:val="center"/>
               <w:rPr>
                 <w:rFonts w:hAnsi="함초롬바탕" w:cs="함초롬바탕"/>
@@ -4296,7 +4334,7 @@
         </w:tc>
         <w:tc>
           <w:tcPr>
-            <w:tcW w:w="0" w:type="auto"/>
+            <w:tcW w:w="1021" w:type="dxa"/>
             <w:tcBorders>
               <w:top w:val="single" w:sz="2" w:space="0" w:color="000000"/>
               <w:left w:val="single" w:sz="2" w:space="0" w:color="000000"/>
@@ -4317,7 +4355,7 @@
               <w:wordWrap/>
               <w:autoSpaceDE/>
               <w:autoSpaceDN/>
-              <w:spacing w:line="340" w:lineRule="exact"/>
+              <w:spacing w:line="216" w:lineRule="auto"/>
               <w:jc w:val="center"/>
               <w:rPr>
                 <w:rFonts w:hAnsi="함초롬바탕" w:cs="함초롬바탕"/>
@@ -4330,7 +4368,7 @@
         </w:tc>
         <w:tc>
           <w:tcPr>
-            <w:tcW w:w="0" w:type="auto"/>
+            <w:tcW w:w="1021" w:type="dxa"/>
             <w:tcBorders>
               <w:top w:val="single" w:sz="2" w:space="0" w:color="000000"/>
               <w:left w:val="single" w:sz="2" w:space="0" w:color="000000"/>
@@ -4351,7 +4389,7 @@
               <w:wordWrap/>
               <w:autoSpaceDE/>
               <w:autoSpaceDN/>
-              <w:spacing w:line="340" w:lineRule="exact"/>
+              <w:spacing w:line="216" w:lineRule="auto"/>
               <w:jc w:val="center"/>
               <w:rPr>
                 <w:rFonts w:hAnsi="함초롬바탕" w:cs="함초롬바탕"/>
@@ -4364,7 +4402,7 @@
         </w:tc>
         <w:tc>
           <w:tcPr>
-            <w:tcW w:w="0" w:type="auto"/>
+            <w:tcW w:w="1021" w:type="dxa"/>
             <w:tcBorders>
               <w:top w:val="single" w:sz="2" w:space="0" w:color="000000"/>
               <w:left w:val="single" w:sz="2" w:space="0" w:color="000000"/>
@@ -4385,7 +4423,7 @@
               <w:wordWrap/>
               <w:autoSpaceDE/>
               <w:autoSpaceDN/>
-              <w:spacing w:line="340" w:lineRule="exact"/>
+              <w:spacing w:line="216" w:lineRule="auto"/>
               <w:jc w:val="center"/>
               <w:rPr>
                 <w:rFonts w:hAnsi="함초롬바탕" w:cs="함초롬바탕"/>
@@ -4398,24 +4436,24 @@
         </w:tc>
         <w:tc>
           <w:tcPr>
-            <w:tcW w:w="0" w:type="auto"/>
-            <w:tcBorders>
-              <w:top w:val="single" w:sz="2" w:space="0" w:color="000000"/>
-              <w:left w:val="single" w:sz="2" w:space="0" w:color="000000"/>
-              <w:bottom w:val="single" w:sz="2" w:space="0" w:color="000000"/>
-              <w:right w:val="single" w:sz="2" w:space="0" w:color="000000"/>
-            </w:tcBorders>
-            <w:tcMar>
-              <w:top w:w="28" w:type="dxa"/>
-              <w:left w:w="102" w:type="dxa"/>
-              <w:bottom w:w="28" w:type="dxa"/>
-              <w:right w:w="102" w:type="dxa"/>
-            </w:tcMar>
-            <w:vAlign w:val="center"/>
-          </w:tcPr>
-          <w:p>
-            <w:pPr>
-              <w:spacing w:after="0" w:line="360" w:lineRule="auto"/>
+            <w:tcW w:w="1021" w:type="dxa"/>
+            <w:tcBorders>
+              <w:top w:val="single" w:sz="2" w:space="0" w:color="000000"/>
+              <w:left w:val="single" w:sz="2" w:space="0" w:color="000000"/>
+              <w:bottom w:val="single" w:sz="2" w:space="0" w:color="000000"/>
+              <w:right w:val="single" w:sz="2" w:space="0" w:color="000000"/>
+            </w:tcBorders>
+            <w:tcMar>
+              <w:top w:w="28" w:type="dxa"/>
+              <w:left w:w="102" w:type="dxa"/>
+              <w:bottom w:w="28" w:type="dxa"/>
+              <w:right w:w="102" w:type="dxa"/>
+            </w:tcMar>
+            <w:vAlign w:val="center"/>
+          </w:tcPr>
+          <w:p>
+            <w:pPr>
+              <w:spacing w:after="0" w:line="216" w:lineRule="auto"/>
               <w:ind w:left="780" w:hanging="780"/>
               <w:jc w:val="center"/>
               <w:textAlignment w:val="baseline"/>
@@ -4433,24 +4471,24 @@
         </w:tc>
         <w:tc>
           <w:tcPr>
-            <w:tcW w:w="0" w:type="auto"/>
-            <w:tcBorders>
-              <w:top w:val="single" w:sz="2" w:space="0" w:color="000000"/>
-              <w:left w:val="single" w:sz="2" w:space="0" w:color="000000"/>
-              <w:bottom w:val="single" w:sz="2" w:space="0" w:color="000000"/>
-              <w:right w:val="single" w:sz="2" w:space="0" w:color="000000"/>
-            </w:tcBorders>
-            <w:tcMar>
-              <w:top w:w="28" w:type="dxa"/>
-              <w:left w:w="102" w:type="dxa"/>
-              <w:bottom w:w="28" w:type="dxa"/>
-              <w:right w:w="102" w:type="dxa"/>
-            </w:tcMar>
-            <w:vAlign w:val="center"/>
-          </w:tcPr>
-          <w:p>
-            <w:pPr>
-              <w:spacing w:after="0" w:line="360" w:lineRule="auto"/>
+            <w:tcW w:w="1021" w:type="dxa"/>
+            <w:tcBorders>
+              <w:top w:val="single" w:sz="2" w:space="0" w:color="000000"/>
+              <w:left w:val="single" w:sz="2" w:space="0" w:color="000000"/>
+              <w:bottom w:val="single" w:sz="2" w:space="0" w:color="000000"/>
+              <w:right w:val="single" w:sz="2" w:space="0" w:color="000000"/>
+            </w:tcBorders>
+            <w:tcMar>
+              <w:top w:w="28" w:type="dxa"/>
+              <w:left w:w="102" w:type="dxa"/>
+              <w:bottom w:w="28" w:type="dxa"/>
+              <w:right w:w="102" w:type="dxa"/>
+            </w:tcMar>
+            <w:vAlign w:val="center"/>
+          </w:tcPr>
+          <w:p>
+            <w:pPr>
+              <w:spacing w:after="0" w:line="216" w:lineRule="auto"/>
               <w:ind w:left="780" w:hanging="780"/>
               <w:jc w:val="center"/>
               <w:textAlignment w:val="baseline"/>
@@ -4468,24 +4506,24 @@
         </w:tc>
         <w:tc>
           <w:tcPr>
-            <w:tcW w:w="0" w:type="auto"/>
-            <w:tcBorders>
-              <w:top w:val="single" w:sz="2" w:space="0" w:color="000000"/>
-              <w:left w:val="single" w:sz="2" w:space="0" w:color="000000"/>
-              <w:bottom w:val="single" w:sz="2" w:space="0" w:color="000000"/>
-              <w:right w:val="single" w:sz="2" w:space="0" w:color="000000"/>
-            </w:tcBorders>
-            <w:tcMar>
-              <w:top w:w="28" w:type="dxa"/>
-              <w:left w:w="102" w:type="dxa"/>
-              <w:bottom w:w="28" w:type="dxa"/>
-              <w:right w:w="102" w:type="dxa"/>
-            </w:tcMar>
-            <w:vAlign w:val="center"/>
-          </w:tcPr>
-          <w:p>
-            <w:pPr>
-              <w:spacing w:after="0" w:line="360" w:lineRule="auto"/>
+            <w:tcW w:w="1021" w:type="dxa"/>
+            <w:tcBorders>
+              <w:top w:val="single" w:sz="2" w:space="0" w:color="000000"/>
+              <w:left w:val="single" w:sz="2" w:space="0" w:color="000000"/>
+              <w:bottom w:val="single" w:sz="2" w:space="0" w:color="000000"/>
+              <w:right w:val="single" w:sz="2" w:space="0" w:color="000000"/>
+            </w:tcBorders>
+            <w:tcMar>
+              <w:top w:w="28" w:type="dxa"/>
+              <w:left w:w="102" w:type="dxa"/>
+              <w:bottom w:w="28" w:type="dxa"/>
+              <w:right w:w="102" w:type="dxa"/>
+            </w:tcMar>
+            <w:vAlign w:val="center"/>
+          </w:tcPr>
+          <w:p>
+            <w:pPr>
+              <w:spacing w:after="0" w:line="216" w:lineRule="auto"/>
               <w:ind w:left="780" w:hanging="780"/>
               <w:jc w:val="center"/>
               <w:textAlignment w:val="baseline"/>
@@ -4503,24 +4541,24 @@
         </w:tc>
         <w:tc>
           <w:tcPr>
-            <w:tcW w:w="0" w:type="auto"/>
-            <w:tcBorders>
-              <w:top w:val="single" w:sz="2" w:space="0" w:color="000000"/>
-              <w:left w:val="single" w:sz="2" w:space="0" w:color="000000"/>
-              <w:bottom w:val="single" w:sz="2" w:space="0" w:color="000000"/>
-              <w:right w:val="single" w:sz="2" w:space="0" w:color="000000"/>
-            </w:tcBorders>
-            <w:tcMar>
-              <w:top w:w="28" w:type="dxa"/>
-              <w:left w:w="102" w:type="dxa"/>
-              <w:bottom w:w="28" w:type="dxa"/>
-              <w:right w:w="102" w:type="dxa"/>
-            </w:tcMar>
-            <w:vAlign w:val="center"/>
-          </w:tcPr>
-          <w:p>
-            <w:pPr>
-              <w:spacing w:after="0" w:line="360" w:lineRule="auto"/>
+            <w:tcW w:w="1021" w:type="dxa"/>
+            <w:tcBorders>
+              <w:top w:val="single" w:sz="2" w:space="0" w:color="000000"/>
+              <w:left w:val="single" w:sz="2" w:space="0" w:color="000000"/>
+              <w:bottom w:val="single" w:sz="2" w:space="0" w:color="000000"/>
+              <w:right w:val="single" w:sz="2" w:space="0" w:color="000000"/>
+            </w:tcBorders>
+            <w:tcMar>
+              <w:top w:w="28" w:type="dxa"/>
+              <w:left w:w="102" w:type="dxa"/>
+              <w:bottom w:w="28" w:type="dxa"/>
+              <w:right w:w="102" w:type="dxa"/>
+            </w:tcMar>
+            <w:vAlign w:val="center"/>
+          </w:tcPr>
+          <w:p>
+            <w:pPr>
+              <w:spacing w:after="0" w:line="216" w:lineRule="auto"/>
               <w:ind w:left="780" w:hanging="780"/>
               <w:jc w:val="center"/>
               <w:textAlignment w:val="baseline"/>
@@ -4538,24 +4576,24 @@
         </w:tc>
         <w:tc>
           <w:tcPr>
-            <w:tcW w:w="0" w:type="auto"/>
-            <w:tcBorders>
-              <w:top w:val="single" w:sz="2" w:space="0" w:color="000000"/>
-              <w:left w:val="single" w:sz="2" w:space="0" w:color="000000"/>
-              <w:bottom w:val="single" w:sz="2" w:space="0" w:color="000000"/>
-              <w:right w:val="single" w:sz="2" w:space="0" w:color="000000"/>
-            </w:tcBorders>
-            <w:tcMar>
-              <w:top w:w="28" w:type="dxa"/>
-              <w:left w:w="102" w:type="dxa"/>
-              <w:bottom w:w="28" w:type="dxa"/>
-              <w:right w:w="102" w:type="dxa"/>
-            </w:tcMar>
-            <w:vAlign w:val="center"/>
-          </w:tcPr>
-          <w:p>
-            <w:pPr>
-              <w:spacing w:after="0" w:line="360" w:lineRule="auto"/>
+            <w:tcW w:w="1021" w:type="dxa"/>
+            <w:tcBorders>
+              <w:top w:val="single" w:sz="2" w:space="0" w:color="000000"/>
+              <w:left w:val="single" w:sz="2" w:space="0" w:color="000000"/>
+              <w:bottom w:val="single" w:sz="2" w:space="0" w:color="000000"/>
+              <w:right w:val="single" w:sz="2" w:space="0" w:color="000000"/>
+            </w:tcBorders>
+            <w:tcMar>
+              <w:top w:w="28" w:type="dxa"/>
+              <w:left w:w="102" w:type="dxa"/>
+              <w:bottom w:w="28" w:type="dxa"/>
+              <w:right w:w="102" w:type="dxa"/>
+            </w:tcMar>
+            <w:vAlign w:val="center"/>
+          </w:tcPr>
+          <w:p>
+            <w:pPr>
+              <w:spacing w:after="0" w:line="216" w:lineRule="auto"/>
               <w:ind w:left="780" w:hanging="780"/>
               <w:jc w:val="center"/>
               <w:textAlignment w:val="baseline"/>
@@ -4573,24 +4611,24 @@
         </w:tc>
         <w:tc>
           <w:tcPr>
-            <w:tcW w:w="0" w:type="auto"/>
-            <w:tcBorders>
-              <w:top w:val="single" w:sz="2" w:space="0" w:color="000000"/>
-              <w:left w:val="single" w:sz="2" w:space="0" w:color="000000"/>
-              <w:bottom w:val="single" w:sz="2" w:space="0" w:color="000000"/>
-              <w:right w:val="single" w:sz="2" w:space="0" w:color="000000"/>
-            </w:tcBorders>
-            <w:tcMar>
-              <w:top w:w="28" w:type="dxa"/>
-              <w:left w:w="102" w:type="dxa"/>
-              <w:bottom w:w="28" w:type="dxa"/>
-              <w:right w:w="102" w:type="dxa"/>
-            </w:tcMar>
-            <w:vAlign w:val="center"/>
-          </w:tcPr>
-          <w:p>
-            <w:pPr>
-              <w:spacing w:after="0" w:line="360" w:lineRule="auto"/>
+            <w:tcW w:w="1021" w:type="dxa"/>
+            <w:tcBorders>
+              <w:top w:val="single" w:sz="2" w:space="0" w:color="000000"/>
+              <w:left w:val="single" w:sz="2" w:space="0" w:color="000000"/>
+              <w:bottom w:val="single" w:sz="2" w:space="0" w:color="000000"/>
+              <w:right w:val="single" w:sz="2" w:space="0" w:color="000000"/>
+            </w:tcBorders>
+            <w:tcMar>
+              <w:top w:w="28" w:type="dxa"/>
+              <w:left w:w="102" w:type="dxa"/>
+              <w:bottom w:w="28" w:type="dxa"/>
+              <w:right w:w="102" w:type="dxa"/>
+            </w:tcMar>
+            <w:vAlign w:val="center"/>
+          </w:tcPr>
+          <w:p>
+            <w:pPr>
+              <w:spacing w:after="0" w:line="216" w:lineRule="auto"/>
               <w:ind w:left="780" w:hanging="780"/>
               <w:jc w:val="center"/>
               <w:textAlignment w:val="baseline"/>
@@ -4608,24 +4646,24 @@
         </w:tc>
         <w:tc>
           <w:tcPr>
-            <w:tcW w:w="1132" w:type="dxa"/>
-            <w:tcBorders>
-              <w:top w:val="single" w:sz="2" w:space="0" w:color="000000"/>
-              <w:left w:val="single" w:sz="2" w:space="0" w:color="000000"/>
-              <w:bottom w:val="single" w:sz="2" w:space="0" w:color="000000"/>
-              <w:right w:val="single" w:sz="2" w:space="0" w:color="000000"/>
-            </w:tcBorders>
-            <w:tcMar>
-              <w:top w:w="28" w:type="dxa"/>
-              <w:left w:w="102" w:type="dxa"/>
-              <w:bottom w:w="28" w:type="dxa"/>
-              <w:right w:w="102" w:type="dxa"/>
-            </w:tcMar>
-            <w:vAlign w:val="center"/>
-          </w:tcPr>
-          <w:p>
-            <w:pPr>
-              <w:spacing w:after="0" w:line="360" w:lineRule="auto"/>
+            <w:tcW w:w="1021" w:type="dxa"/>
+            <w:tcBorders>
+              <w:top w:val="single" w:sz="2" w:space="0" w:color="000000"/>
+              <w:left w:val="single" w:sz="2" w:space="0" w:color="000000"/>
+              <w:bottom w:val="single" w:sz="2" w:space="0" w:color="000000"/>
+              <w:right w:val="single" w:sz="2" w:space="0" w:color="000000"/>
+            </w:tcBorders>
+            <w:tcMar>
+              <w:top w:w="28" w:type="dxa"/>
+              <w:left w:w="102" w:type="dxa"/>
+              <w:bottom w:w="28" w:type="dxa"/>
+              <w:right w:w="102" w:type="dxa"/>
+            </w:tcMar>
+            <w:vAlign w:val="center"/>
+          </w:tcPr>
+          <w:p>
+            <w:pPr>
+              <w:spacing w:after="0" w:line="216" w:lineRule="auto"/>
               <w:ind w:left="780" w:hanging="780"/>
               <w:jc w:val="center"/>
               <w:textAlignment w:val="baseline"/>
@@ -4648,1977 +4686,7 @@
         </w:trPr>
         <w:tc>
           <w:tcPr>
-            <w:tcW w:w="829" w:type="dxa"/>
-            <w:tcBorders>
-              <w:top w:val="single" w:sz="2" w:space="0" w:color="000000"/>
-              <w:left w:val="single" w:sz="2" w:space="0" w:color="000000"/>
-              <w:bottom w:val="single" w:sz="2" w:space="0" w:color="000000"/>
-              <w:right w:val="single" w:sz="2" w:space="0" w:color="000000"/>
-            </w:tcBorders>
-            <w:tcMar>
-              <w:top w:w="28" w:type="dxa"/>
-              <w:left w:w="102" w:type="dxa"/>
-              <w:bottom w:w="28" w:type="dxa"/>
-              <w:right w:w="102" w:type="dxa"/>
-            </w:tcMar>
-            <w:vAlign w:val="center"/>
-            <w:hideMark/>
-          </w:tcPr>
-          <w:p>
-            <w:pPr>
-              <w:spacing w:after="0" w:line="384" w:lineRule="auto"/>
-              <w:jc w:val="center"/>
-              <w:textAlignment w:val="baseline"/>
-              <w:rPr>
-                <w:rFonts w:ascii="함초롬바탕" w:eastAsia="함초롬바탕" w:hAnsi="함초롬바탕" w:cs="함초롬바탕"/>
-                <w:b/>
-                <w:bCs/>
-                <w:color w:val="000000" w:themeColor="text1"/>
-                <w:sz w:val="14"/>
-                <w:szCs w:val="14"/>
-              </w:rPr>
-            </w:pPr>
-          </w:p>
-        </w:tc>
-        <w:tc>
-          <w:tcPr>
-            <w:tcW w:w="0" w:type="auto"/>
-            <w:tcBorders>
-              <w:top w:val="single" w:sz="2" w:space="0" w:color="000000"/>
-              <w:left w:val="single" w:sz="2" w:space="0" w:color="000000"/>
-              <w:bottom w:val="single" w:sz="2" w:space="0" w:color="000000"/>
-              <w:right w:val="single" w:sz="2" w:space="0" w:color="000000"/>
-            </w:tcBorders>
-            <w:tcMar>
-              <w:top w:w="28" w:type="dxa"/>
-              <w:left w:w="102" w:type="dxa"/>
-              <w:bottom w:w="28" w:type="dxa"/>
-              <w:right w:w="102" w:type="dxa"/>
-            </w:tcMar>
-            <w:vAlign w:val="center"/>
-            <w:hideMark/>
-          </w:tcPr>
-          <w:p>
-            <w:pPr>
-              <w:spacing w:after="0" w:line="384" w:lineRule="auto"/>
-              <w:jc w:val="center"/>
-              <w:textAlignment w:val="baseline"/>
-              <w:rPr>
-                <w:rFonts w:ascii="함초롬바탕" w:eastAsia="함초롬바탕" w:hAnsi="함초롬바탕" w:cs="함초롬바탕"/>
-                <w:b/>
-                <w:bCs/>
-                <w:color w:val="000000" w:themeColor="text1"/>
-                <w:sz w:val="14"/>
-                <w:szCs w:val="14"/>
-              </w:rPr>
-            </w:pPr>
-          </w:p>
-        </w:tc>
-        <w:tc>
-          <w:tcPr>
-            <w:tcW w:w="0" w:type="auto"/>
-            <w:tcBorders>
-              <w:top w:val="single" w:sz="2" w:space="0" w:color="000000"/>
-              <w:left w:val="single" w:sz="2" w:space="0" w:color="000000"/>
-              <w:bottom w:val="single" w:sz="2" w:space="0" w:color="000000"/>
-              <w:right w:val="single" w:sz="2" w:space="0" w:color="000000"/>
-            </w:tcBorders>
-            <w:tcMar>
-              <w:top w:w="28" w:type="dxa"/>
-              <w:left w:w="102" w:type="dxa"/>
-              <w:bottom w:w="28" w:type="dxa"/>
-              <w:right w:w="102" w:type="dxa"/>
-            </w:tcMar>
-            <w:vAlign w:val="center"/>
-            <w:hideMark/>
-          </w:tcPr>
-          <w:p>
-            <w:pPr>
-              <w:shd w:val="clear" w:color="auto" w:fill="CACACA"/>
-              <w:spacing w:after="0" w:line="384" w:lineRule="auto"/>
-              <w:jc w:val="center"/>
-              <w:textAlignment w:val="baseline"/>
-              <w:rPr>
-                <w:rFonts w:ascii="함초롬바탕" w:eastAsia="함초롬바탕" w:hAnsi="함초롬바탕" w:cs="함초롬바탕"/>
-                <w:b/>
-                <w:bCs/>
-                <w:color w:val="000000" w:themeColor="text1"/>
-                <w:sz w:val="14"/>
-                <w:szCs w:val="14"/>
-              </w:rPr>
-            </w:pPr>
-          </w:p>
-        </w:tc>
-        <w:tc>
-          <w:tcPr>
-            <w:tcW w:w="0" w:type="auto"/>
-            <w:tcBorders>
-              <w:top w:val="single" w:sz="2" w:space="0" w:color="000000"/>
-              <w:left w:val="single" w:sz="2" w:space="0" w:color="000000"/>
-              <w:bottom w:val="single" w:sz="2" w:space="0" w:color="000000"/>
-              <w:right w:val="single" w:sz="2" w:space="0" w:color="000000"/>
-            </w:tcBorders>
-            <w:tcMar>
-              <w:top w:w="28" w:type="dxa"/>
-              <w:left w:w="102" w:type="dxa"/>
-              <w:bottom w:w="28" w:type="dxa"/>
-              <w:right w:w="102" w:type="dxa"/>
-            </w:tcMar>
-            <w:vAlign w:val="center"/>
-            <w:hideMark/>
-          </w:tcPr>
-          <w:p>
-            <w:pPr>
-              <w:spacing w:after="0" w:line="384" w:lineRule="auto"/>
-              <w:jc w:val="center"/>
-              <w:textAlignment w:val="baseline"/>
-              <w:rPr>
-                <w:rFonts w:ascii="함초롬바탕" w:eastAsia="함초롬바탕" w:hAnsi="함초롬바탕" w:cs="함초롬바탕"/>
-                <w:b/>
-                <w:bCs/>
-                <w:color w:val="000000" w:themeColor="text1"/>
-                <w:sz w:val="14"/>
-                <w:szCs w:val="14"/>
-              </w:rPr>
-            </w:pPr>
-          </w:p>
-        </w:tc>
-        <w:tc>
-          <w:tcPr>
-            <w:tcW w:w="0" w:type="auto"/>
-            <w:tcBorders>
-              <w:top w:val="single" w:sz="2" w:space="0" w:color="000000"/>
-              <w:left w:val="single" w:sz="2" w:space="0" w:color="000000"/>
-              <w:bottom w:val="single" w:sz="2" w:space="0" w:color="000000"/>
-              <w:right w:val="single" w:sz="2" w:space="0" w:color="000000"/>
-            </w:tcBorders>
-            <w:tcMar>
-              <w:top w:w="28" w:type="dxa"/>
-              <w:left w:w="102" w:type="dxa"/>
-              <w:bottom w:w="28" w:type="dxa"/>
-              <w:right w:w="102" w:type="dxa"/>
-            </w:tcMar>
-            <w:vAlign w:val="center"/>
-            <w:hideMark/>
-          </w:tcPr>
-          <w:p>
-            <w:pPr>
-              <w:spacing w:after="0" w:line="360" w:lineRule="auto"/>
-              <w:ind w:left="780" w:hanging="780"/>
-              <w:jc w:val="center"/>
-              <w:textAlignment w:val="baseline"/>
-              <w:rPr>
-                <w:rFonts w:ascii="함초롬바탕" w:eastAsia="함초롬바탕" w:hAnsi="함초롬바탕" w:cs="함초롬바탕"/>
-                <w:b/>
-                <w:bCs/>
-                <w:color w:val="000000" w:themeColor="text1"/>
-                <w:spacing w:val="-16"/>
-                <w:sz w:val="14"/>
-                <w:szCs w:val="14"/>
-              </w:rPr>
-            </w:pPr>
-          </w:p>
-        </w:tc>
-        <w:tc>
-          <w:tcPr>
-            <w:tcW w:w="0" w:type="auto"/>
-            <w:tcBorders>
-              <w:top w:val="single" w:sz="2" w:space="0" w:color="000000"/>
-              <w:left w:val="single" w:sz="2" w:space="0" w:color="000000"/>
-              <w:bottom w:val="single" w:sz="2" w:space="0" w:color="000000"/>
-              <w:right w:val="single" w:sz="2" w:space="0" w:color="000000"/>
-            </w:tcBorders>
-            <w:tcMar>
-              <w:top w:w="28" w:type="dxa"/>
-              <w:left w:w="102" w:type="dxa"/>
-              <w:bottom w:w="28" w:type="dxa"/>
-              <w:right w:w="102" w:type="dxa"/>
-            </w:tcMar>
-            <w:vAlign w:val="center"/>
-            <w:hideMark/>
-          </w:tcPr>
-          <w:p>
-            <w:pPr>
-              <w:spacing w:after="0" w:line="360" w:lineRule="auto"/>
-              <w:ind w:left="780" w:hanging="780"/>
-              <w:jc w:val="center"/>
-              <w:textAlignment w:val="baseline"/>
-              <w:rPr>
-                <w:rFonts w:ascii="함초롬바탕" w:eastAsia="함초롬바탕" w:hAnsi="함초롬바탕" w:cs="함초롬바탕"/>
-                <w:b/>
-                <w:bCs/>
-                <w:color w:val="000000" w:themeColor="text1"/>
-                <w:spacing w:val="-16"/>
-                <w:sz w:val="14"/>
-                <w:szCs w:val="14"/>
-              </w:rPr>
-            </w:pPr>
-          </w:p>
-        </w:tc>
-        <w:tc>
-          <w:tcPr>
-            <w:tcW w:w="0" w:type="auto"/>
-            <w:tcBorders>
-              <w:top w:val="single" w:sz="2" w:space="0" w:color="000000"/>
-              <w:left w:val="single" w:sz="2" w:space="0" w:color="000000"/>
-              <w:bottom w:val="single" w:sz="2" w:space="0" w:color="000000"/>
-              <w:right w:val="single" w:sz="2" w:space="0" w:color="000000"/>
-            </w:tcBorders>
-            <w:tcMar>
-              <w:top w:w="28" w:type="dxa"/>
-              <w:left w:w="102" w:type="dxa"/>
-              <w:bottom w:w="28" w:type="dxa"/>
-              <w:right w:w="102" w:type="dxa"/>
-            </w:tcMar>
-            <w:vAlign w:val="center"/>
-            <w:hideMark/>
-          </w:tcPr>
-          <w:p>
-            <w:pPr>
-              <w:spacing w:after="0" w:line="360" w:lineRule="auto"/>
-              <w:ind w:left="780" w:hanging="780"/>
-              <w:jc w:val="center"/>
-              <w:textAlignment w:val="baseline"/>
-              <w:rPr>
-                <w:rFonts w:ascii="함초롬바탕" w:eastAsia="함초롬바탕" w:hAnsi="함초롬바탕" w:cs="함초롬바탕"/>
-                <w:b/>
-                <w:bCs/>
-                <w:color w:val="000000" w:themeColor="text1"/>
-                <w:spacing w:val="-16"/>
-                <w:sz w:val="14"/>
-                <w:szCs w:val="14"/>
-              </w:rPr>
-            </w:pPr>
-          </w:p>
-        </w:tc>
-        <w:tc>
-          <w:tcPr>
-            <w:tcW w:w="0" w:type="auto"/>
-            <w:tcBorders>
-              <w:top w:val="single" w:sz="2" w:space="0" w:color="000000"/>
-              <w:left w:val="single" w:sz="2" w:space="0" w:color="000000"/>
-              <w:bottom w:val="single" w:sz="2" w:space="0" w:color="000000"/>
-              <w:right w:val="single" w:sz="2" w:space="0" w:color="000000"/>
-            </w:tcBorders>
-            <w:tcMar>
-              <w:top w:w="28" w:type="dxa"/>
-              <w:left w:w="102" w:type="dxa"/>
-              <w:bottom w:w="28" w:type="dxa"/>
-              <w:right w:w="102" w:type="dxa"/>
-            </w:tcMar>
-            <w:vAlign w:val="center"/>
-            <w:hideMark/>
-          </w:tcPr>
-          <w:p>
-            <w:pPr>
-              <w:spacing w:after="0" w:line="360" w:lineRule="auto"/>
-              <w:ind w:left="780" w:hanging="780"/>
-              <w:jc w:val="center"/>
-              <w:textAlignment w:val="baseline"/>
-              <w:rPr>
-                <w:rFonts w:ascii="함초롬바탕" w:eastAsia="함초롬바탕" w:hAnsi="함초롬바탕" w:cs="함초롬바탕"/>
-                <w:b/>
-                <w:bCs/>
-                <w:color w:val="000000" w:themeColor="text1"/>
-                <w:spacing w:val="-16"/>
-                <w:sz w:val="14"/>
-                <w:szCs w:val="14"/>
-              </w:rPr>
-            </w:pPr>
-          </w:p>
-        </w:tc>
-        <w:tc>
-          <w:tcPr>
-            <w:tcW w:w="0" w:type="auto"/>
-            <w:tcBorders>
-              <w:top w:val="single" w:sz="2" w:space="0" w:color="000000"/>
-              <w:left w:val="single" w:sz="2" w:space="0" w:color="000000"/>
-              <w:bottom w:val="single" w:sz="2" w:space="0" w:color="000000"/>
-              <w:right w:val="single" w:sz="2" w:space="0" w:color="000000"/>
-            </w:tcBorders>
-            <w:tcMar>
-              <w:top w:w="28" w:type="dxa"/>
-              <w:left w:w="102" w:type="dxa"/>
-              <w:bottom w:w="28" w:type="dxa"/>
-              <w:right w:w="102" w:type="dxa"/>
-            </w:tcMar>
-            <w:vAlign w:val="center"/>
-            <w:hideMark/>
-          </w:tcPr>
-          <w:p>
-            <w:pPr>
-              <w:spacing w:after="0" w:line="360" w:lineRule="auto"/>
-              <w:ind w:left="780" w:hanging="780"/>
-              <w:jc w:val="center"/>
-              <w:textAlignment w:val="baseline"/>
-              <w:rPr>
-                <w:rFonts w:ascii="함초롬바탕" w:eastAsia="함초롬바탕" w:hAnsi="함초롬바탕" w:cs="함초롬바탕"/>
-                <w:b/>
-                <w:bCs/>
-                <w:color w:val="000000" w:themeColor="text1"/>
-                <w:spacing w:val="-16"/>
-                <w:sz w:val="14"/>
-                <w:szCs w:val="14"/>
-              </w:rPr>
-            </w:pPr>
-          </w:p>
-        </w:tc>
-        <w:tc>
-          <w:tcPr>
-            <w:tcW w:w="0" w:type="auto"/>
-            <w:tcBorders>
-              <w:top w:val="single" w:sz="2" w:space="0" w:color="000000"/>
-              <w:left w:val="single" w:sz="2" w:space="0" w:color="000000"/>
-              <w:bottom w:val="single" w:sz="2" w:space="0" w:color="000000"/>
-              <w:right w:val="single" w:sz="2" w:space="0" w:color="000000"/>
-            </w:tcBorders>
-            <w:tcMar>
-              <w:top w:w="28" w:type="dxa"/>
-              <w:left w:w="102" w:type="dxa"/>
-              <w:bottom w:w="28" w:type="dxa"/>
-              <w:right w:w="102" w:type="dxa"/>
-            </w:tcMar>
-            <w:vAlign w:val="center"/>
-            <w:hideMark/>
-          </w:tcPr>
-          <w:p>
-            <w:pPr>
-              <w:spacing w:after="0" w:line="360" w:lineRule="auto"/>
-              <w:ind w:left="780" w:hanging="780"/>
-              <w:jc w:val="center"/>
-              <w:textAlignment w:val="baseline"/>
-              <w:rPr>
-                <w:rFonts w:ascii="함초롬바탕" w:eastAsia="함초롬바탕" w:hAnsi="함초롬바탕" w:cs="함초롬바탕"/>
-                <w:b/>
-                <w:bCs/>
-                <w:color w:val="000000" w:themeColor="text1"/>
-                <w:spacing w:val="-16"/>
-                <w:sz w:val="14"/>
-                <w:szCs w:val="14"/>
-              </w:rPr>
-            </w:pPr>
-          </w:p>
-        </w:tc>
-        <w:tc>
-          <w:tcPr>
-            <w:tcW w:w="1132" w:type="dxa"/>
-            <w:tcBorders>
-              <w:top w:val="single" w:sz="2" w:space="0" w:color="000000"/>
-              <w:left w:val="single" w:sz="2" w:space="0" w:color="000000"/>
-              <w:bottom w:val="single" w:sz="2" w:space="0" w:color="000000"/>
-              <w:right w:val="single" w:sz="2" w:space="0" w:color="000000"/>
-            </w:tcBorders>
-            <w:tcMar>
-              <w:top w:w="28" w:type="dxa"/>
-              <w:left w:w="102" w:type="dxa"/>
-              <w:bottom w:w="28" w:type="dxa"/>
-              <w:right w:w="102" w:type="dxa"/>
-            </w:tcMar>
-            <w:vAlign w:val="center"/>
-            <w:hideMark/>
-          </w:tcPr>
-          <w:p>
-            <w:pPr>
-              <w:spacing w:after="0" w:line="360" w:lineRule="auto"/>
-              <w:ind w:left="780" w:hanging="780"/>
-              <w:jc w:val="center"/>
-              <w:textAlignment w:val="baseline"/>
-              <w:rPr>
-                <w:rFonts w:ascii="함초롬바탕" w:eastAsia="함초롬바탕" w:hAnsi="함초롬바탕" w:cs="함초롬바탕"/>
-                <w:b/>
-                <w:bCs/>
-                <w:color w:val="000000" w:themeColor="text1"/>
-                <w:spacing w:val="-22"/>
-                <w:sz w:val="14"/>
-                <w:szCs w:val="14"/>
-              </w:rPr>
-            </w:pPr>
-          </w:p>
-        </w:tc>
-      </w:tr>
-      <w:tr>
-        <w:trPr>
-          <w:trHeight w:val="475"/>
-        </w:trPr>
-        <w:tc>
-          <w:tcPr>
-            <w:tcW w:w="829" w:type="dxa"/>
-            <w:tcBorders>
-              <w:top w:val="single" w:sz="2" w:space="0" w:color="000000"/>
-              <w:left w:val="single" w:sz="2" w:space="0" w:color="000000"/>
-              <w:bottom w:val="single" w:sz="2" w:space="0" w:color="000000"/>
-              <w:right w:val="single" w:sz="2" w:space="0" w:color="000000"/>
-            </w:tcBorders>
-            <w:tcMar>
-              <w:top w:w="28" w:type="dxa"/>
-              <w:left w:w="102" w:type="dxa"/>
-              <w:bottom w:w="28" w:type="dxa"/>
-              <w:right w:w="102" w:type="dxa"/>
-            </w:tcMar>
-            <w:vAlign w:val="center"/>
-            <w:hideMark/>
-          </w:tcPr>
-          <w:p>
-            <w:pPr>
-              <w:spacing w:after="0" w:line="384" w:lineRule="auto"/>
-              <w:jc w:val="center"/>
-              <w:textAlignment w:val="baseline"/>
-              <w:rPr>
-                <w:rFonts w:ascii="함초롬바탕" w:eastAsia="함초롬바탕" w:hAnsi="함초롬바탕" w:cs="함초롬바탕"/>
-                <w:b/>
-                <w:bCs/>
-                <w:color w:val="000000" w:themeColor="text1"/>
-                <w:sz w:val="14"/>
-                <w:szCs w:val="14"/>
-              </w:rPr>
-            </w:pPr>
-          </w:p>
-        </w:tc>
-        <w:tc>
-          <w:tcPr>
-            <w:tcW w:w="0" w:type="auto"/>
-            <w:tcBorders>
-              <w:top w:val="single" w:sz="2" w:space="0" w:color="000000"/>
-              <w:left w:val="single" w:sz="2" w:space="0" w:color="000000"/>
-              <w:bottom w:val="single" w:sz="2" w:space="0" w:color="000000"/>
-              <w:right w:val="single" w:sz="2" w:space="0" w:color="000000"/>
-            </w:tcBorders>
-            <w:tcMar>
-              <w:top w:w="28" w:type="dxa"/>
-              <w:left w:w="102" w:type="dxa"/>
-              <w:bottom w:w="28" w:type="dxa"/>
-              <w:right w:w="102" w:type="dxa"/>
-            </w:tcMar>
-            <w:vAlign w:val="center"/>
-            <w:hideMark/>
-          </w:tcPr>
-          <w:p>
-            <w:pPr>
-              <w:spacing w:after="0" w:line="384" w:lineRule="auto"/>
-              <w:jc w:val="center"/>
-              <w:textAlignment w:val="baseline"/>
-              <w:rPr>
-                <w:rFonts w:ascii="함초롬바탕" w:eastAsia="함초롬바탕" w:hAnsi="함초롬바탕" w:cs="함초롬바탕"/>
-                <w:b/>
-                <w:bCs/>
-                <w:color w:val="000000" w:themeColor="text1"/>
-                <w:sz w:val="14"/>
-                <w:szCs w:val="14"/>
-              </w:rPr>
-            </w:pPr>
-          </w:p>
-        </w:tc>
-        <w:tc>
-          <w:tcPr>
-            <w:tcW w:w="0" w:type="auto"/>
-            <w:tcBorders>
-              <w:top w:val="single" w:sz="2" w:space="0" w:color="000000"/>
-              <w:left w:val="single" w:sz="2" w:space="0" w:color="000000"/>
-              <w:bottom w:val="single" w:sz="2" w:space="0" w:color="000000"/>
-              <w:right w:val="single" w:sz="2" w:space="0" w:color="000000"/>
-            </w:tcBorders>
-            <w:tcMar>
-              <w:top w:w="28" w:type="dxa"/>
-              <w:left w:w="102" w:type="dxa"/>
-              <w:bottom w:w="28" w:type="dxa"/>
-              <w:right w:w="102" w:type="dxa"/>
-            </w:tcMar>
-            <w:vAlign w:val="center"/>
-            <w:hideMark/>
-          </w:tcPr>
-          <w:p>
-            <w:pPr>
-              <w:shd w:val="clear" w:color="auto" w:fill="CACACA"/>
-              <w:spacing w:after="0" w:line="384" w:lineRule="auto"/>
-              <w:jc w:val="center"/>
-              <w:textAlignment w:val="baseline"/>
-              <w:rPr>
-                <w:rFonts w:ascii="함초롬바탕" w:eastAsia="함초롬바탕" w:hAnsi="함초롬바탕" w:cs="함초롬바탕"/>
-                <w:b/>
-                <w:bCs/>
-                <w:color w:val="000000" w:themeColor="text1"/>
-                <w:sz w:val="14"/>
-                <w:szCs w:val="14"/>
-              </w:rPr>
-            </w:pPr>
-          </w:p>
-        </w:tc>
-        <w:tc>
-          <w:tcPr>
-            <w:tcW w:w="0" w:type="auto"/>
-            <w:tcBorders>
-              <w:top w:val="single" w:sz="2" w:space="0" w:color="000000"/>
-              <w:left w:val="single" w:sz="2" w:space="0" w:color="000000"/>
-              <w:bottom w:val="single" w:sz="2" w:space="0" w:color="000000"/>
-              <w:right w:val="single" w:sz="2" w:space="0" w:color="000000"/>
-            </w:tcBorders>
-            <w:tcMar>
-              <w:top w:w="28" w:type="dxa"/>
-              <w:left w:w="102" w:type="dxa"/>
-              <w:bottom w:w="28" w:type="dxa"/>
-              <w:right w:w="102" w:type="dxa"/>
-            </w:tcMar>
-            <w:vAlign w:val="center"/>
-            <w:hideMark/>
-          </w:tcPr>
-          <w:p>
-            <w:pPr>
-              <w:spacing w:after="0" w:line="384" w:lineRule="auto"/>
-              <w:jc w:val="center"/>
-              <w:textAlignment w:val="baseline"/>
-              <w:rPr>
-                <w:rFonts w:ascii="함초롬바탕" w:eastAsia="함초롬바탕" w:hAnsi="함초롬바탕" w:cs="함초롬바탕"/>
-                <w:b/>
-                <w:bCs/>
-                <w:color w:val="000000" w:themeColor="text1"/>
-                <w:sz w:val="14"/>
-                <w:szCs w:val="14"/>
-              </w:rPr>
-            </w:pPr>
-          </w:p>
-        </w:tc>
-        <w:tc>
-          <w:tcPr>
-            <w:tcW w:w="0" w:type="auto"/>
-            <w:tcBorders>
-              <w:top w:val="single" w:sz="2" w:space="0" w:color="000000"/>
-              <w:left w:val="single" w:sz="2" w:space="0" w:color="000000"/>
-              <w:bottom w:val="single" w:sz="2" w:space="0" w:color="000000"/>
-              <w:right w:val="single" w:sz="2" w:space="0" w:color="000000"/>
-            </w:tcBorders>
-            <w:tcMar>
-              <w:top w:w="28" w:type="dxa"/>
-              <w:left w:w="102" w:type="dxa"/>
-              <w:bottom w:w="28" w:type="dxa"/>
-              <w:right w:w="102" w:type="dxa"/>
-            </w:tcMar>
-            <w:vAlign w:val="center"/>
-            <w:hideMark/>
-          </w:tcPr>
-          <w:p>
-            <w:pPr>
-              <w:spacing w:after="0" w:line="360" w:lineRule="auto"/>
-              <w:ind w:left="780" w:hanging="780"/>
-              <w:jc w:val="center"/>
-              <w:textAlignment w:val="baseline"/>
-              <w:rPr>
-                <w:rFonts w:ascii="함초롬바탕" w:eastAsia="함초롬바탕" w:hAnsi="함초롬바탕" w:cs="함초롬바탕"/>
-                <w:b/>
-                <w:bCs/>
-                <w:color w:val="000000" w:themeColor="text1"/>
-                <w:spacing w:val="-16"/>
-                <w:sz w:val="14"/>
-                <w:szCs w:val="14"/>
-              </w:rPr>
-            </w:pPr>
-          </w:p>
-        </w:tc>
-        <w:tc>
-          <w:tcPr>
-            <w:tcW w:w="0" w:type="auto"/>
-            <w:tcBorders>
-              <w:top w:val="single" w:sz="2" w:space="0" w:color="000000"/>
-              <w:left w:val="single" w:sz="2" w:space="0" w:color="000000"/>
-              <w:bottom w:val="single" w:sz="2" w:space="0" w:color="000000"/>
-              <w:right w:val="single" w:sz="2" w:space="0" w:color="000000"/>
-            </w:tcBorders>
-            <w:tcMar>
-              <w:top w:w="28" w:type="dxa"/>
-              <w:left w:w="102" w:type="dxa"/>
-              <w:bottom w:w="28" w:type="dxa"/>
-              <w:right w:w="102" w:type="dxa"/>
-            </w:tcMar>
-            <w:vAlign w:val="center"/>
-            <w:hideMark/>
-          </w:tcPr>
-          <w:p>
-            <w:pPr>
-              <w:spacing w:after="0" w:line="360" w:lineRule="auto"/>
-              <w:ind w:left="780" w:hanging="780"/>
-              <w:jc w:val="center"/>
-              <w:textAlignment w:val="baseline"/>
-              <w:rPr>
-                <w:rFonts w:ascii="함초롬바탕" w:eastAsia="함초롬바탕" w:hAnsi="함초롬바탕" w:cs="함초롬바탕"/>
-                <w:b/>
-                <w:bCs/>
-                <w:color w:val="000000" w:themeColor="text1"/>
-                <w:spacing w:val="-16"/>
-                <w:sz w:val="14"/>
-                <w:szCs w:val="14"/>
-              </w:rPr>
-            </w:pPr>
-          </w:p>
-        </w:tc>
-        <w:tc>
-          <w:tcPr>
-            <w:tcW w:w="0" w:type="auto"/>
-            <w:tcBorders>
-              <w:top w:val="single" w:sz="2" w:space="0" w:color="000000"/>
-              <w:left w:val="single" w:sz="2" w:space="0" w:color="000000"/>
-              <w:bottom w:val="single" w:sz="2" w:space="0" w:color="000000"/>
-              <w:right w:val="single" w:sz="2" w:space="0" w:color="000000"/>
-            </w:tcBorders>
-            <w:tcMar>
-              <w:top w:w="28" w:type="dxa"/>
-              <w:left w:w="102" w:type="dxa"/>
-              <w:bottom w:w="28" w:type="dxa"/>
-              <w:right w:w="102" w:type="dxa"/>
-            </w:tcMar>
-            <w:vAlign w:val="center"/>
-            <w:hideMark/>
-          </w:tcPr>
-          <w:p>
-            <w:pPr>
-              <w:spacing w:after="0" w:line="360" w:lineRule="auto"/>
-              <w:ind w:left="780" w:hanging="780"/>
-              <w:jc w:val="center"/>
-              <w:textAlignment w:val="baseline"/>
-              <w:rPr>
-                <w:rFonts w:ascii="함초롬바탕" w:eastAsia="함초롬바탕" w:hAnsi="함초롬바탕" w:cs="함초롬바탕"/>
-                <w:b/>
-                <w:bCs/>
-                <w:color w:val="000000" w:themeColor="text1"/>
-                <w:spacing w:val="-16"/>
-                <w:sz w:val="14"/>
-                <w:szCs w:val="14"/>
-              </w:rPr>
-            </w:pPr>
-          </w:p>
-        </w:tc>
-        <w:tc>
-          <w:tcPr>
-            <w:tcW w:w="0" w:type="auto"/>
-            <w:tcBorders>
-              <w:top w:val="single" w:sz="2" w:space="0" w:color="000000"/>
-              <w:left w:val="single" w:sz="2" w:space="0" w:color="000000"/>
-              <w:bottom w:val="single" w:sz="2" w:space="0" w:color="000000"/>
-              <w:right w:val="single" w:sz="2" w:space="0" w:color="000000"/>
-            </w:tcBorders>
-            <w:tcMar>
-              <w:top w:w="28" w:type="dxa"/>
-              <w:left w:w="102" w:type="dxa"/>
-              <w:bottom w:w="28" w:type="dxa"/>
-              <w:right w:w="102" w:type="dxa"/>
-            </w:tcMar>
-            <w:vAlign w:val="center"/>
-            <w:hideMark/>
-          </w:tcPr>
-          <w:p>
-            <w:pPr>
-              <w:spacing w:after="0" w:line="360" w:lineRule="auto"/>
-              <w:ind w:left="780" w:hanging="780"/>
-              <w:jc w:val="center"/>
-              <w:textAlignment w:val="baseline"/>
-              <w:rPr>
-                <w:rFonts w:ascii="함초롬바탕" w:eastAsia="함초롬바탕" w:hAnsi="함초롬바탕" w:cs="함초롬바탕"/>
-                <w:b/>
-                <w:bCs/>
-                <w:color w:val="000000" w:themeColor="text1"/>
-                <w:spacing w:val="-16"/>
-                <w:sz w:val="14"/>
-                <w:szCs w:val="14"/>
-              </w:rPr>
-            </w:pPr>
-          </w:p>
-        </w:tc>
-        <w:tc>
-          <w:tcPr>
-            <w:tcW w:w="0" w:type="auto"/>
-            <w:tcBorders>
-              <w:top w:val="single" w:sz="2" w:space="0" w:color="000000"/>
-              <w:left w:val="single" w:sz="2" w:space="0" w:color="000000"/>
-              <w:bottom w:val="single" w:sz="2" w:space="0" w:color="000000"/>
-              <w:right w:val="single" w:sz="2" w:space="0" w:color="000000"/>
-            </w:tcBorders>
-            <w:tcMar>
-              <w:top w:w="28" w:type="dxa"/>
-              <w:left w:w="102" w:type="dxa"/>
-              <w:bottom w:w="28" w:type="dxa"/>
-              <w:right w:w="102" w:type="dxa"/>
-            </w:tcMar>
-            <w:vAlign w:val="center"/>
-            <w:hideMark/>
-          </w:tcPr>
-          <w:p>
-            <w:pPr>
-              <w:spacing w:after="0" w:line="360" w:lineRule="auto"/>
-              <w:ind w:left="780" w:hanging="780"/>
-              <w:jc w:val="center"/>
-              <w:textAlignment w:val="baseline"/>
-              <w:rPr>
-                <w:rFonts w:ascii="함초롬바탕" w:eastAsia="함초롬바탕" w:hAnsi="함초롬바탕" w:cs="함초롬바탕"/>
-                <w:b/>
-                <w:bCs/>
-                <w:color w:val="000000" w:themeColor="text1"/>
-                <w:spacing w:val="-16"/>
-                <w:sz w:val="14"/>
-                <w:szCs w:val="14"/>
-              </w:rPr>
-            </w:pPr>
-          </w:p>
-        </w:tc>
-        <w:tc>
-          <w:tcPr>
-            <w:tcW w:w="0" w:type="auto"/>
-            <w:tcBorders>
-              <w:top w:val="single" w:sz="2" w:space="0" w:color="000000"/>
-              <w:left w:val="single" w:sz="2" w:space="0" w:color="000000"/>
-              <w:bottom w:val="single" w:sz="2" w:space="0" w:color="000000"/>
-              <w:right w:val="single" w:sz="2" w:space="0" w:color="000000"/>
-            </w:tcBorders>
-            <w:tcMar>
-              <w:top w:w="28" w:type="dxa"/>
-              <w:left w:w="102" w:type="dxa"/>
-              <w:bottom w:w="28" w:type="dxa"/>
-              <w:right w:w="102" w:type="dxa"/>
-            </w:tcMar>
-            <w:vAlign w:val="center"/>
-            <w:hideMark/>
-          </w:tcPr>
-          <w:p>
-            <w:pPr>
-              <w:spacing w:after="0" w:line="360" w:lineRule="auto"/>
-              <w:ind w:left="780" w:hanging="780"/>
-              <w:jc w:val="center"/>
-              <w:textAlignment w:val="baseline"/>
-              <w:rPr>
-                <w:rFonts w:ascii="함초롬바탕" w:eastAsia="함초롬바탕" w:hAnsi="함초롬바탕" w:cs="함초롬바탕"/>
-                <w:b/>
-                <w:bCs/>
-                <w:color w:val="000000" w:themeColor="text1"/>
-                <w:spacing w:val="-16"/>
-                <w:sz w:val="14"/>
-                <w:szCs w:val="14"/>
-              </w:rPr>
-            </w:pPr>
-          </w:p>
-        </w:tc>
-        <w:tc>
-          <w:tcPr>
-            <w:tcW w:w="1132" w:type="dxa"/>
-            <w:tcBorders>
-              <w:top w:val="single" w:sz="2" w:space="0" w:color="000000"/>
-              <w:left w:val="single" w:sz="2" w:space="0" w:color="000000"/>
-              <w:bottom w:val="single" w:sz="2" w:space="0" w:color="000000"/>
-              <w:right w:val="single" w:sz="2" w:space="0" w:color="000000"/>
-            </w:tcBorders>
-            <w:tcMar>
-              <w:top w:w="28" w:type="dxa"/>
-              <w:left w:w="102" w:type="dxa"/>
-              <w:bottom w:w="28" w:type="dxa"/>
-              <w:right w:w="102" w:type="dxa"/>
-            </w:tcMar>
-            <w:vAlign w:val="center"/>
-            <w:hideMark/>
-          </w:tcPr>
-          <w:p>
-            <w:pPr>
-              <w:spacing w:after="0" w:line="360" w:lineRule="auto"/>
-              <w:ind w:left="780" w:hanging="780"/>
-              <w:jc w:val="center"/>
-              <w:textAlignment w:val="baseline"/>
-              <w:rPr>
-                <w:rFonts w:ascii="함초롬바탕" w:eastAsia="함초롬바탕" w:hAnsi="함초롬바탕" w:cs="함초롬바탕"/>
-                <w:b/>
-                <w:bCs/>
-                <w:color w:val="000000" w:themeColor="text1"/>
-                <w:spacing w:val="-22"/>
-                <w:sz w:val="14"/>
-                <w:szCs w:val="14"/>
-              </w:rPr>
-            </w:pPr>
-          </w:p>
-        </w:tc>
-      </w:tr>
-      <w:tr>
-        <w:trPr>
-          <w:trHeight w:val="475"/>
-        </w:trPr>
-        <w:tc>
-          <w:tcPr>
-            <w:tcW w:w="829" w:type="dxa"/>
-            <w:tcBorders>
-              <w:top w:val="single" w:sz="2" w:space="0" w:color="000000"/>
-              <w:left w:val="single" w:sz="2" w:space="0" w:color="000000"/>
-              <w:bottom w:val="single" w:sz="2" w:space="0" w:color="000000"/>
-              <w:right w:val="single" w:sz="2" w:space="0" w:color="000000"/>
-            </w:tcBorders>
-            <w:tcMar>
-              <w:top w:w="28" w:type="dxa"/>
-              <w:left w:w="102" w:type="dxa"/>
-              <w:bottom w:w="28" w:type="dxa"/>
-              <w:right w:w="102" w:type="dxa"/>
-            </w:tcMar>
-            <w:vAlign w:val="center"/>
-            <w:hideMark/>
-          </w:tcPr>
-          <w:p>
-            <w:pPr>
-              <w:spacing w:after="0" w:line="384" w:lineRule="auto"/>
-              <w:jc w:val="center"/>
-              <w:textAlignment w:val="baseline"/>
-              <w:rPr>
-                <w:rFonts w:ascii="함초롬바탕" w:eastAsia="함초롬바탕" w:hAnsi="함초롬바탕" w:cs="함초롬바탕"/>
-                <w:b/>
-                <w:bCs/>
-                <w:color w:val="000000" w:themeColor="text1"/>
-                <w:sz w:val="14"/>
-                <w:szCs w:val="14"/>
-              </w:rPr>
-            </w:pPr>
-          </w:p>
-        </w:tc>
-        <w:tc>
-          <w:tcPr>
-            <w:tcW w:w="0" w:type="auto"/>
-            <w:tcBorders>
-              <w:top w:val="single" w:sz="2" w:space="0" w:color="000000"/>
-              <w:left w:val="single" w:sz="2" w:space="0" w:color="000000"/>
-              <w:bottom w:val="single" w:sz="2" w:space="0" w:color="000000"/>
-              <w:right w:val="single" w:sz="2" w:space="0" w:color="000000"/>
-            </w:tcBorders>
-            <w:tcMar>
-              <w:top w:w="28" w:type="dxa"/>
-              <w:left w:w="102" w:type="dxa"/>
-              <w:bottom w:w="28" w:type="dxa"/>
-              <w:right w:w="102" w:type="dxa"/>
-            </w:tcMar>
-            <w:vAlign w:val="center"/>
-            <w:hideMark/>
-          </w:tcPr>
-          <w:p>
-            <w:pPr>
-              <w:spacing w:after="0" w:line="384" w:lineRule="auto"/>
-              <w:jc w:val="center"/>
-              <w:textAlignment w:val="baseline"/>
-              <w:rPr>
-                <w:rFonts w:ascii="함초롬바탕" w:eastAsia="함초롬바탕" w:hAnsi="함초롬바탕" w:cs="함초롬바탕"/>
-                <w:b/>
-                <w:bCs/>
-                <w:color w:val="000000" w:themeColor="text1"/>
-                <w:sz w:val="14"/>
-                <w:szCs w:val="14"/>
-              </w:rPr>
-            </w:pPr>
-          </w:p>
-        </w:tc>
-        <w:tc>
-          <w:tcPr>
-            <w:tcW w:w="0" w:type="auto"/>
-            <w:tcBorders>
-              <w:top w:val="single" w:sz="2" w:space="0" w:color="000000"/>
-              <w:left w:val="single" w:sz="2" w:space="0" w:color="000000"/>
-              <w:bottom w:val="single" w:sz="2" w:space="0" w:color="000000"/>
-              <w:right w:val="single" w:sz="2" w:space="0" w:color="000000"/>
-            </w:tcBorders>
-            <w:tcMar>
-              <w:top w:w="28" w:type="dxa"/>
-              <w:left w:w="102" w:type="dxa"/>
-              <w:bottom w:w="28" w:type="dxa"/>
-              <w:right w:w="102" w:type="dxa"/>
-            </w:tcMar>
-            <w:vAlign w:val="center"/>
-            <w:hideMark/>
-          </w:tcPr>
-          <w:p>
-            <w:pPr>
-              <w:shd w:val="clear" w:color="auto" w:fill="CACACA"/>
-              <w:spacing w:after="0" w:line="384" w:lineRule="auto"/>
-              <w:jc w:val="center"/>
-              <w:textAlignment w:val="baseline"/>
-              <w:rPr>
-                <w:rFonts w:ascii="함초롬바탕" w:eastAsia="함초롬바탕" w:hAnsi="함초롬바탕" w:cs="함초롬바탕"/>
-                <w:b/>
-                <w:bCs/>
-                <w:color w:val="000000" w:themeColor="text1"/>
-                <w:sz w:val="14"/>
-                <w:szCs w:val="14"/>
-              </w:rPr>
-            </w:pPr>
-          </w:p>
-        </w:tc>
-        <w:tc>
-          <w:tcPr>
-            <w:tcW w:w="0" w:type="auto"/>
-            <w:tcBorders>
-              <w:top w:val="single" w:sz="2" w:space="0" w:color="000000"/>
-              <w:left w:val="single" w:sz="2" w:space="0" w:color="000000"/>
-              <w:bottom w:val="single" w:sz="2" w:space="0" w:color="000000"/>
-              <w:right w:val="single" w:sz="2" w:space="0" w:color="000000"/>
-            </w:tcBorders>
-            <w:tcMar>
-              <w:top w:w="28" w:type="dxa"/>
-              <w:left w:w="102" w:type="dxa"/>
-              <w:bottom w:w="28" w:type="dxa"/>
-              <w:right w:w="102" w:type="dxa"/>
-            </w:tcMar>
-            <w:vAlign w:val="center"/>
-            <w:hideMark/>
-          </w:tcPr>
-          <w:p>
-            <w:pPr>
-              <w:spacing w:after="0" w:line="384" w:lineRule="auto"/>
-              <w:jc w:val="center"/>
-              <w:textAlignment w:val="baseline"/>
-              <w:rPr>
-                <w:rFonts w:ascii="함초롬바탕" w:eastAsia="함초롬바탕" w:hAnsi="함초롬바탕" w:cs="함초롬바탕"/>
-                <w:b/>
-                <w:bCs/>
-                <w:color w:val="000000" w:themeColor="text1"/>
-                <w:sz w:val="14"/>
-                <w:szCs w:val="14"/>
-              </w:rPr>
-            </w:pPr>
-          </w:p>
-        </w:tc>
-        <w:tc>
-          <w:tcPr>
-            <w:tcW w:w="0" w:type="auto"/>
-            <w:tcBorders>
-              <w:top w:val="single" w:sz="2" w:space="0" w:color="000000"/>
-              <w:left w:val="single" w:sz="2" w:space="0" w:color="000000"/>
-              <w:bottom w:val="single" w:sz="2" w:space="0" w:color="000000"/>
-              <w:right w:val="single" w:sz="2" w:space="0" w:color="000000"/>
-            </w:tcBorders>
-            <w:tcMar>
-              <w:top w:w="28" w:type="dxa"/>
-              <w:left w:w="102" w:type="dxa"/>
-              <w:bottom w:w="28" w:type="dxa"/>
-              <w:right w:w="102" w:type="dxa"/>
-            </w:tcMar>
-            <w:vAlign w:val="center"/>
-            <w:hideMark/>
-          </w:tcPr>
-          <w:p>
-            <w:pPr>
-              <w:spacing w:after="0" w:line="360" w:lineRule="auto"/>
-              <w:ind w:left="780" w:hanging="780"/>
-              <w:jc w:val="center"/>
-              <w:textAlignment w:val="baseline"/>
-              <w:rPr>
-                <w:rFonts w:ascii="함초롬바탕" w:eastAsia="함초롬바탕" w:hAnsi="함초롬바탕" w:cs="함초롬바탕"/>
-                <w:b/>
-                <w:bCs/>
-                <w:color w:val="000000" w:themeColor="text1"/>
-                <w:spacing w:val="-16"/>
-                <w:sz w:val="14"/>
-                <w:szCs w:val="14"/>
-              </w:rPr>
-            </w:pPr>
-          </w:p>
-        </w:tc>
-        <w:tc>
-          <w:tcPr>
-            <w:tcW w:w="0" w:type="auto"/>
-            <w:tcBorders>
-              <w:top w:val="single" w:sz="2" w:space="0" w:color="000000"/>
-              <w:left w:val="single" w:sz="2" w:space="0" w:color="000000"/>
-              <w:bottom w:val="single" w:sz="2" w:space="0" w:color="000000"/>
-              <w:right w:val="single" w:sz="2" w:space="0" w:color="000000"/>
-            </w:tcBorders>
-            <w:tcMar>
-              <w:top w:w="28" w:type="dxa"/>
-              <w:left w:w="102" w:type="dxa"/>
-              <w:bottom w:w="28" w:type="dxa"/>
-              <w:right w:w="102" w:type="dxa"/>
-            </w:tcMar>
-            <w:vAlign w:val="center"/>
-            <w:hideMark/>
-          </w:tcPr>
-          <w:p>
-            <w:pPr>
-              <w:spacing w:after="0" w:line="360" w:lineRule="auto"/>
-              <w:ind w:left="780" w:hanging="780"/>
-              <w:jc w:val="center"/>
-              <w:textAlignment w:val="baseline"/>
-              <w:rPr>
-                <w:rFonts w:ascii="함초롬바탕" w:eastAsia="함초롬바탕" w:hAnsi="함초롬바탕" w:cs="함초롬바탕"/>
-                <w:b/>
-                <w:bCs/>
-                <w:color w:val="000000" w:themeColor="text1"/>
-                <w:spacing w:val="-16"/>
-                <w:sz w:val="14"/>
-                <w:szCs w:val="14"/>
-              </w:rPr>
-            </w:pPr>
-          </w:p>
-        </w:tc>
-        <w:tc>
-          <w:tcPr>
-            <w:tcW w:w="0" w:type="auto"/>
-            <w:tcBorders>
-              <w:top w:val="single" w:sz="2" w:space="0" w:color="000000"/>
-              <w:left w:val="single" w:sz="2" w:space="0" w:color="000000"/>
-              <w:bottom w:val="single" w:sz="2" w:space="0" w:color="000000"/>
-              <w:right w:val="single" w:sz="2" w:space="0" w:color="000000"/>
-            </w:tcBorders>
-            <w:tcMar>
-              <w:top w:w="28" w:type="dxa"/>
-              <w:left w:w="102" w:type="dxa"/>
-              <w:bottom w:w="28" w:type="dxa"/>
-              <w:right w:w="102" w:type="dxa"/>
-            </w:tcMar>
-            <w:vAlign w:val="center"/>
-            <w:hideMark/>
-          </w:tcPr>
-          <w:p>
-            <w:pPr>
-              <w:spacing w:after="0" w:line="360" w:lineRule="auto"/>
-              <w:ind w:left="780" w:hanging="780"/>
-              <w:jc w:val="center"/>
-              <w:textAlignment w:val="baseline"/>
-              <w:rPr>
-                <w:rFonts w:ascii="함초롬바탕" w:eastAsia="함초롬바탕" w:hAnsi="함초롬바탕" w:cs="함초롬바탕"/>
-                <w:b/>
-                <w:bCs/>
-                <w:color w:val="000000" w:themeColor="text1"/>
-                <w:spacing w:val="-16"/>
-                <w:sz w:val="14"/>
-                <w:szCs w:val="14"/>
-              </w:rPr>
-            </w:pPr>
-          </w:p>
-        </w:tc>
-        <w:tc>
-          <w:tcPr>
-            <w:tcW w:w="0" w:type="auto"/>
-            <w:tcBorders>
-              <w:top w:val="single" w:sz="2" w:space="0" w:color="000000"/>
-              <w:left w:val="single" w:sz="2" w:space="0" w:color="000000"/>
-              <w:bottom w:val="single" w:sz="2" w:space="0" w:color="000000"/>
-              <w:right w:val="single" w:sz="2" w:space="0" w:color="000000"/>
-            </w:tcBorders>
-            <w:tcMar>
-              <w:top w:w="28" w:type="dxa"/>
-              <w:left w:w="102" w:type="dxa"/>
-              <w:bottom w:w="28" w:type="dxa"/>
-              <w:right w:w="102" w:type="dxa"/>
-            </w:tcMar>
-            <w:vAlign w:val="center"/>
-            <w:hideMark/>
-          </w:tcPr>
-          <w:p>
-            <w:pPr>
-              <w:spacing w:after="0" w:line="360" w:lineRule="auto"/>
-              <w:ind w:left="780" w:hanging="780"/>
-              <w:jc w:val="center"/>
-              <w:textAlignment w:val="baseline"/>
-              <w:rPr>
-                <w:rFonts w:ascii="함초롬바탕" w:eastAsia="함초롬바탕" w:hAnsi="함초롬바탕" w:cs="함초롬바탕"/>
-                <w:b/>
-                <w:bCs/>
-                <w:color w:val="000000" w:themeColor="text1"/>
-                <w:spacing w:val="-16"/>
-                <w:sz w:val="14"/>
-                <w:szCs w:val="14"/>
-              </w:rPr>
-            </w:pPr>
-          </w:p>
-        </w:tc>
-        <w:tc>
-          <w:tcPr>
-            <w:tcW w:w="0" w:type="auto"/>
-            <w:tcBorders>
-              <w:top w:val="single" w:sz="2" w:space="0" w:color="000000"/>
-              <w:left w:val="single" w:sz="2" w:space="0" w:color="000000"/>
-              <w:bottom w:val="single" w:sz="2" w:space="0" w:color="000000"/>
-              <w:right w:val="single" w:sz="2" w:space="0" w:color="000000"/>
-            </w:tcBorders>
-            <w:tcMar>
-              <w:top w:w="28" w:type="dxa"/>
-              <w:left w:w="102" w:type="dxa"/>
-              <w:bottom w:w="28" w:type="dxa"/>
-              <w:right w:w="102" w:type="dxa"/>
-            </w:tcMar>
-            <w:vAlign w:val="center"/>
-            <w:hideMark/>
-          </w:tcPr>
-          <w:p>
-            <w:pPr>
-              <w:spacing w:after="0" w:line="360" w:lineRule="auto"/>
-              <w:ind w:left="780" w:hanging="780"/>
-              <w:jc w:val="center"/>
-              <w:textAlignment w:val="baseline"/>
-              <w:rPr>
-                <w:rFonts w:ascii="함초롬바탕" w:eastAsia="함초롬바탕" w:hAnsi="함초롬바탕" w:cs="함초롬바탕"/>
-                <w:b/>
-                <w:bCs/>
-                <w:color w:val="000000" w:themeColor="text1"/>
-                <w:spacing w:val="-16"/>
-                <w:sz w:val="14"/>
-                <w:szCs w:val="14"/>
-              </w:rPr>
-            </w:pPr>
-          </w:p>
-        </w:tc>
-        <w:tc>
-          <w:tcPr>
-            <w:tcW w:w="0" w:type="auto"/>
-            <w:tcBorders>
-              <w:top w:val="single" w:sz="2" w:space="0" w:color="000000"/>
-              <w:left w:val="single" w:sz="2" w:space="0" w:color="000000"/>
-              <w:bottom w:val="single" w:sz="2" w:space="0" w:color="000000"/>
-              <w:right w:val="single" w:sz="2" w:space="0" w:color="000000"/>
-            </w:tcBorders>
-            <w:tcMar>
-              <w:top w:w="28" w:type="dxa"/>
-              <w:left w:w="102" w:type="dxa"/>
-              <w:bottom w:w="28" w:type="dxa"/>
-              <w:right w:w="102" w:type="dxa"/>
-            </w:tcMar>
-            <w:vAlign w:val="center"/>
-            <w:hideMark/>
-          </w:tcPr>
-          <w:p>
-            <w:pPr>
-              <w:spacing w:after="0" w:line="360" w:lineRule="auto"/>
-              <w:ind w:left="780" w:hanging="780"/>
-              <w:jc w:val="center"/>
-              <w:textAlignment w:val="baseline"/>
-              <w:rPr>
-                <w:rFonts w:ascii="함초롬바탕" w:eastAsia="함초롬바탕" w:hAnsi="함초롬바탕" w:cs="함초롬바탕"/>
-                <w:b/>
-                <w:bCs/>
-                <w:color w:val="000000" w:themeColor="text1"/>
-                <w:spacing w:val="-16"/>
-                <w:sz w:val="14"/>
-                <w:szCs w:val="14"/>
-              </w:rPr>
-            </w:pPr>
-          </w:p>
-        </w:tc>
-        <w:tc>
-          <w:tcPr>
-            <w:tcW w:w="1132" w:type="dxa"/>
-            <w:tcBorders>
-              <w:top w:val="single" w:sz="2" w:space="0" w:color="000000"/>
-              <w:left w:val="single" w:sz="2" w:space="0" w:color="000000"/>
-              <w:bottom w:val="single" w:sz="2" w:space="0" w:color="000000"/>
-              <w:right w:val="single" w:sz="2" w:space="0" w:color="000000"/>
-            </w:tcBorders>
-            <w:tcMar>
-              <w:top w:w="28" w:type="dxa"/>
-              <w:left w:w="102" w:type="dxa"/>
-              <w:bottom w:w="28" w:type="dxa"/>
-              <w:right w:w="102" w:type="dxa"/>
-            </w:tcMar>
-            <w:vAlign w:val="center"/>
-            <w:hideMark/>
-          </w:tcPr>
-          <w:p>
-            <w:pPr>
-              <w:spacing w:after="0" w:line="360" w:lineRule="auto"/>
-              <w:ind w:left="780" w:hanging="780"/>
-              <w:jc w:val="center"/>
-              <w:textAlignment w:val="baseline"/>
-              <w:rPr>
-                <w:rFonts w:ascii="함초롬바탕" w:eastAsia="함초롬바탕" w:hAnsi="함초롬바탕" w:cs="함초롬바탕"/>
-                <w:b/>
-                <w:bCs/>
-                <w:color w:val="000000" w:themeColor="text1"/>
-                <w:spacing w:val="-22"/>
-                <w:sz w:val="14"/>
-                <w:szCs w:val="14"/>
-              </w:rPr>
-            </w:pPr>
-          </w:p>
-        </w:tc>
-      </w:tr>
-      <w:tr>
-        <w:trPr>
-          <w:trHeight w:val="475"/>
-        </w:trPr>
-        <w:tc>
-          <w:tcPr>
-            <w:tcW w:w="829" w:type="dxa"/>
-            <w:tcBorders>
-              <w:top w:val="single" w:sz="2" w:space="0" w:color="000000"/>
-              <w:left w:val="single" w:sz="2" w:space="0" w:color="000000"/>
-              <w:bottom w:val="single" w:sz="2" w:space="0" w:color="000000"/>
-              <w:right w:val="single" w:sz="2" w:space="0" w:color="000000"/>
-            </w:tcBorders>
-            <w:tcMar>
-              <w:top w:w="28" w:type="dxa"/>
-              <w:left w:w="102" w:type="dxa"/>
-              <w:bottom w:w="28" w:type="dxa"/>
-              <w:right w:w="102" w:type="dxa"/>
-            </w:tcMar>
-            <w:vAlign w:val="center"/>
-            <w:hideMark/>
-          </w:tcPr>
-          <w:p>
-            <w:pPr>
-              <w:spacing w:after="0" w:line="384" w:lineRule="auto"/>
-              <w:jc w:val="center"/>
-              <w:textAlignment w:val="baseline"/>
-              <w:rPr>
-                <w:rFonts w:ascii="함초롬바탕" w:eastAsia="함초롬바탕" w:hAnsi="함초롬바탕" w:cs="함초롬바탕"/>
-                <w:b/>
-                <w:bCs/>
-                <w:color w:val="000000" w:themeColor="text1"/>
-                <w:sz w:val="14"/>
-                <w:szCs w:val="14"/>
-              </w:rPr>
-            </w:pPr>
-          </w:p>
-        </w:tc>
-        <w:tc>
-          <w:tcPr>
-            <w:tcW w:w="0" w:type="auto"/>
-            <w:tcBorders>
-              <w:top w:val="single" w:sz="2" w:space="0" w:color="000000"/>
-              <w:left w:val="single" w:sz="2" w:space="0" w:color="000000"/>
-              <w:bottom w:val="single" w:sz="2" w:space="0" w:color="000000"/>
-              <w:right w:val="single" w:sz="2" w:space="0" w:color="000000"/>
-            </w:tcBorders>
-            <w:tcMar>
-              <w:top w:w="28" w:type="dxa"/>
-              <w:left w:w="102" w:type="dxa"/>
-              <w:bottom w:w="28" w:type="dxa"/>
-              <w:right w:w="102" w:type="dxa"/>
-            </w:tcMar>
-            <w:vAlign w:val="center"/>
-            <w:hideMark/>
-          </w:tcPr>
-          <w:p>
-            <w:pPr>
-              <w:spacing w:after="0" w:line="384" w:lineRule="auto"/>
-              <w:jc w:val="center"/>
-              <w:textAlignment w:val="baseline"/>
-              <w:rPr>
-                <w:rFonts w:ascii="함초롬바탕" w:eastAsia="함초롬바탕" w:hAnsi="함초롬바탕" w:cs="함초롬바탕"/>
-                <w:b/>
-                <w:bCs/>
-                <w:color w:val="000000" w:themeColor="text1"/>
-                <w:sz w:val="14"/>
-                <w:szCs w:val="14"/>
-              </w:rPr>
-            </w:pPr>
-          </w:p>
-        </w:tc>
-        <w:tc>
-          <w:tcPr>
-            <w:tcW w:w="0" w:type="auto"/>
-            <w:tcBorders>
-              <w:top w:val="single" w:sz="2" w:space="0" w:color="000000"/>
-              <w:left w:val="single" w:sz="2" w:space="0" w:color="000000"/>
-              <w:bottom w:val="single" w:sz="2" w:space="0" w:color="000000"/>
-              <w:right w:val="single" w:sz="2" w:space="0" w:color="000000"/>
-            </w:tcBorders>
-            <w:tcMar>
-              <w:top w:w="28" w:type="dxa"/>
-              <w:left w:w="102" w:type="dxa"/>
-              <w:bottom w:w="28" w:type="dxa"/>
-              <w:right w:w="102" w:type="dxa"/>
-            </w:tcMar>
-            <w:vAlign w:val="center"/>
-            <w:hideMark/>
-          </w:tcPr>
-          <w:p>
-            <w:pPr>
-              <w:shd w:val="clear" w:color="auto" w:fill="CACACA"/>
-              <w:spacing w:after="0" w:line="384" w:lineRule="auto"/>
-              <w:jc w:val="center"/>
-              <w:textAlignment w:val="baseline"/>
-              <w:rPr>
-                <w:rFonts w:ascii="함초롬바탕" w:eastAsia="함초롬바탕" w:hAnsi="함초롬바탕" w:cs="함초롬바탕"/>
-                <w:b/>
-                <w:bCs/>
-                <w:color w:val="000000" w:themeColor="text1"/>
-                <w:sz w:val="14"/>
-                <w:szCs w:val="14"/>
-              </w:rPr>
-            </w:pPr>
-          </w:p>
-        </w:tc>
-        <w:tc>
-          <w:tcPr>
-            <w:tcW w:w="0" w:type="auto"/>
-            <w:tcBorders>
-              <w:top w:val="single" w:sz="2" w:space="0" w:color="000000"/>
-              <w:left w:val="single" w:sz="2" w:space="0" w:color="000000"/>
-              <w:bottom w:val="single" w:sz="2" w:space="0" w:color="000000"/>
-              <w:right w:val="single" w:sz="2" w:space="0" w:color="000000"/>
-            </w:tcBorders>
-            <w:tcMar>
-              <w:top w:w="28" w:type="dxa"/>
-              <w:left w:w="102" w:type="dxa"/>
-              <w:bottom w:w="28" w:type="dxa"/>
-              <w:right w:w="102" w:type="dxa"/>
-            </w:tcMar>
-            <w:vAlign w:val="center"/>
-            <w:hideMark/>
-          </w:tcPr>
-          <w:p>
-            <w:pPr>
-              <w:spacing w:after="0" w:line="384" w:lineRule="auto"/>
-              <w:jc w:val="center"/>
-              <w:textAlignment w:val="baseline"/>
-              <w:rPr>
-                <w:rFonts w:ascii="함초롬바탕" w:eastAsia="함초롬바탕" w:hAnsi="함초롬바탕" w:cs="함초롬바탕"/>
-                <w:b/>
-                <w:bCs/>
-                <w:color w:val="000000" w:themeColor="text1"/>
-                <w:sz w:val="14"/>
-                <w:szCs w:val="14"/>
-              </w:rPr>
-            </w:pPr>
-          </w:p>
-        </w:tc>
-        <w:tc>
-          <w:tcPr>
-            <w:tcW w:w="0" w:type="auto"/>
-            <w:tcBorders>
-              <w:top w:val="single" w:sz="2" w:space="0" w:color="000000"/>
-              <w:left w:val="single" w:sz="2" w:space="0" w:color="000000"/>
-              <w:bottom w:val="single" w:sz="2" w:space="0" w:color="000000"/>
-              <w:right w:val="single" w:sz="2" w:space="0" w:color="000000"/>
-            </w:tcBorders>
-            <w:tcMar>
-              <w:top w:w="28" w:type="dxa"/>
-              <w:left w:w="102" w:type="dxa"/>
-              <w:bottom w:w="28" w:type="dxa"/>
-              <w:right w:w="102" w:type="dxa"/>
-            </w:tcMar>
-            <w:vAlign w:val="center"/>
-            <w:hideMark/>
-          </w:tcPr>
-          <w:p>
-            <w:pPr>
-              <w:spacing w:after="0" w:line="360" w:lineRule="auto"/>
-              <w:ind w:left="780" w:hanging="780"/>
-              <w:jc w:val="center"/>
-              <w:textAlignment w:val="baseline"/>
-              <w:rPr>
-                <w:rFonts w:ascii="함초롬바탕" w:eastAsia="함초롬바탕" w:hAnsi="함초롬바탕" w:cs="함초롬바탕"/>
-                <w:b/>
-                <w:bCs/>
-                <w:color w:val="000000" w:themeColor="text1"/>
-                <w:spacing w:val="-16"/>
-                <w:sz w:val="14"/>
-                <w:szCs w:val="14"/>
-              </w:rPr>
-            </w:pPr>
-          </w:p>
-        </w:tc>
-        <w:tc>
-          <w:tcPr>
-            <w:tcW w:w="0" w:type="auto"/>
-            <w:tcBorders>
-              <w:top w:val="single" w:sz="2" w:space="0" w:color="000000"/>
-              <w:left w:val="single" w:sz="2" w:space="0" w:color="000000"/>
-              <w:bottom w:val="single" w:sz="2" w:space="0" w:color="000000"/>
-              <w:right w:val="single" w:sz="2" w:space="0" w:color="000000"/>
-            </w:tcBorders>
-            <w:tcMar>
-              <w:top w:w="28" w:type="dxa"/>
-              <w:left w:w="102" w:type="dxa"/>
-              <w:bottom w:w="28" w:type="dxa"/>
-              <w:right w:w="102" w:type="dxa"/>
-            </w:tcMar>
-            <w:vAlign w:val="center"/>
-            <w:hideMark/>
-          </w:tcPr>
-          <w:p>
-            <w:pPr>
-              <w:spacing w:after="0" w:line="360" w:lineRule="auto"/>
-              <w:ind w:left="780" w:hanging="780"/>
-              <w:jc w:val="center"/>
-              <w:textAlignment w:val="baseline"/>
-              <w:rPr>
-                <w:rFonts w:ascii="함초롬바탕" w:eastAsia="함초롬바탕" w:hAnsi="함초롬바탕" w:cs="함초롬바탕"/>
-                <w:b/>
-                <w:bCs/>
-                <w:color w:val="000000" w:themeColor="text1"/>
-                <w:spacing w:val="-16"/>
-                <w:sz w:val="14"/>
-                <w:szCs w:val="14"/>
-              </w:rPr>
-            </w:pPr>
-          </w:p>
-        </w:tc>
-        <w:tc>
-          <w:tcPr>
-            <w:tcW w:w="0" w:type="auto"/>
-            <w:tcBorders>
-              <w:top w:val="single" w:sz="2" w:space="0" w:color="000000"/>
-              <w:left w:val="single" w:sz="2" w:space="0" w:color="000000"/>
-              <w:bottom w:val="single" w:sz="2" w:space="0" w:color="000000"/>
-              <w:right w:val="single" w:sz="2" w:space="0" w:color="000000"/>
-            </w:tcBorders>
-            <w:tcMar>
-              <w:top w:w="28" w:type="dxa"/>
-              <w:left w:w="102" w:type="dxa"/>
-              <w:bottom w:w="28" w:type="dxa"/>
-              <w:right w:w="102" w:type="dxa"/>
-            </w:tcMar>
-            <w:vAlign w:val="center"/>
-            <w:hideMark/>
-          </w:tcPr>
-          <w:p>
-            <w:pPr>
-              <w:spacing w:after="0" w:line="360" w:lineRule="auto"/>
-              <w:ind w:left="780" w:hanging="780"/>
-              <w:jc w:val="center"/>
-              <w:textAlignment w:val="baseline"/>
-              <w:rPr>
-                <w:rFonts w:ascii="함초롬바탕" w:eastAsia="함초롬바탕" w:hAnsi="함초롬바탕" w:cs="함초롬바탕"/>
-                <w:b/>
-                <w:bCs/>
-                <w:color w:val="000000" w:themeColor="text1"/>
-                <w:spacing w:val="-16"/>
-                <w:sz w:val="14"/>
-                <w:szCs w:val="14"/>
-              </w:rPr>
-            </w:pPr>
-          </w:p>
-        </w:tc>
-        <w:tc>
-          <w:tcPr>
-            <w:tcW w:w="0" w:type="auto"/>
-            <w:tcBorders>
-              <w:top w:val="single" w:sz="2" w:space="0" w:color="000000"/>
-              <w:left w:val="single" w:sz="2" w:space="0" w:color="000000"/>
-              <w:bottom w:val="single" w:sz="2" w:space="0" w:color="000000"/>
-              <w:right w:val="single" w:sz="2" w:space="0" w:color="000000"/>
-            </w:tcBorders>
-            <w:tcMar>
-              <w:top w:w="28" w:type="dxa"/>
-              <w:left w:w="102" w:type="dxa"/>
-              <w:bottom w:w="28" w:type="dxa"/>
-              <w:right w:w="102" w:type="dxa"/>
-            </w:tcMar>
-            <w:vAlign w:val="center"/>
-            <w:hideMark/>
-          </w:tcPr>
-          <w:p>
-            <w:pPr>
-              <w:spacing w:after="0" w:line="360" w:lineRule="auto"/>
-              <w:ind w:left="780" w:hanging="780"/>
-              <w:jc w:val="center"/>
-              <w:textAlignment w:val="baseline"/>
-              <w:rPr>
-                <w:rFonts w:ascii="함초롬바탕" w:eastAsia="함초롬바탕" w:hAnsi="함초롬바탕" w:cs="함초롬바탕"/>
-                <w:b/>
-                <w:bCs/>
-                <w:color w:val="000000" w:themeColor="text1"/>
-                <w:spacing w:val="-16"/>
-                <w:sz w:val="14"/>
-                <w:szCs w:val="14"/>
-              </w:rPr>
-            </w:pPr>
-          </w:p>
-        </w:tc>
-        <w:tc>
-          <w:tcPr>
-            <w:tcW w:w="0" w:type="auto"/>
-            <w:tcBorders>
-              <w:top w:val="single" w:sz="2" w:space="0" w:color="000000"/>
-              <w:left w:val="single" w:sz="2" w:space="0" w:color="000000"/>
-              <w:bottom w:val="single" w:sz="2" w:space="0" w:color="000000"/>
-              <w:right w:val="single" w:sz="2" w:space="0" w:color="000000"/>
-            </w:tcBorders>
-            <w:tcMar>
-              <w:top w:w="28" w:type="dxa"/>
-              <w:left w:w="102" w:type="dxa"/>
-              <w:bottom w:w="28" w:type="dxa"/>
-              <w:right w:w="102" w:type="dxa"/>
-            </w:tcMar>
-            <w:vAlign w:val="center"/>
-            <w:hideMark/>
-          </w:tcPr>
-          <w:p>
-            <w:pPr>
-              <w:spacing w:after="0" w:line="360" w:lineRule="auto"/>
-              <w:ind w:left="780" w:hanging="780"/>
-              <w:jc w:val="center"/>
-              <w:textAlignment w:val="baseline"/>
-              <w:rPr>
-                <w:rFonts w:ascii="함초롬바탕" w:eastAsia="함초롬바탕" w:hAnsi="함초롬바탕" w:cs="함초롬바탕"/>
-                <w:b/>
-                <w:bCs/>
-                <w:color w:val="000000" w:themeColor="text1"/>
-                <w:spacing w:val="-16"/>
-                <w:sz w:val="14"/>
-                <w:szCs w:val="14"/>
-              </w:rPr>
-            </w:pPr>
-          </w:p>
-        </w:tc>
-        <w:tc>
-          <w:tcPr>
-            <w:tcW w:w="0" w:type="auto"/>
-            <w:tcBorders>
-              <w:top w:val="single" w:sz="2" w:space="0" w:color="000000"/>
-              <w:left w:val="single" w:sz="2" w:space="0" w:color="000000"/>
-              <w:bottom w:val="single" w:sz="2" w:space="0" w:color="000000"/>
-              <w:right w:val="single" w:sz="2" w:space="0" w:color="000000"/>
-            </w:tcBorders>
-            <w:tcMar>
-              <w:top w:w="28" w:type="dxa"/>
-              <w:left w:w="102" w:type="dxa"/>
-              <w:bottom w:w="28" w:type="dxa"/>
-              <w:right w:w="102" w:type="dxa"/>
-            </w:tcMar>
-            <w:vAlign w:val="center"/>
-            <w:hideMark/>
-          </w:tcPr>
-          <w:p>
-            <w:pPr>
-              <w:spacing w:after="0" w:line="360" w:lineRule="auto"/>
-              <w:ind w:left="780" w:hanging="780"/>
-              <w:jc w:val="center"/>
-              <w:textAlignment w:val="baseline"/>
-              <w:rPr>
-                <w:rFonts w:ascii="함초롬바탕" w:eastAsia="함초롬바탕" w:hAnsi="함초롬바탕" w:cs="함초롬바탕"/>
-                <w:b/>
-                <w:bCs/>
-                <w:color w:val="000000" w:themeColor="text1"/>
-                <w:spacing w:val="-16"/>
-                <w:sz w:val="14"/>
-                <w:szCs w:val="14"/>
-              </w:rPr>
-            </w:pPr>
-          </w:p>
-        </w:tc>
-        <w:tc>
-          <w:tcPr>
-            <w:tcW w:w="1132" w:type="dxa"/>
-            <w:tcBorders>
-              <w:top w:val="single" w:sz="2" w:space="0" w:color="000000"/>
-              <w:left w:val="single" w:sz="2" w:space="0" w:color="000000"/>
-              <w:bottom w:val="single" w:sz="2" w:space="0" w:color="000000"/>
-              <w:right w:val="single" w:sz="2" w:space="0" w:color="000000"/>
-            </w:tcBorders>
-            <w:tcMar>
-              <w:top w:w="28" w:type="dxa"/>
-              <w:left w:w="102" w:type="dxa"/>
-              <w:bottom w:w="28" w:type="dxa"/>
-              <w:right w:w="102" w:type="dxa"/>
-            </w:tcMar>
-            <w:vAlign w:val="center"/>
-            <w:hideMark/>
-          </w:tcPr>
-          <w:p>
-            <w:pPr>
-              <w:spacing w:after="0" w:line="360" w:lineRule="auto"/>
-              <w:ind w:left="780" w:hanging="780"/>
-              <w:jc w:val="center"/>
-              <w:textAlignment w:val="baseline"/>
-              <w:rPr>
-                <w:rFonts w:ascii="함초롬바탕" w:eastAsia="함초롬바탕" w:hAnsi="함초롬바탕" w:cs="함초롬바탕"/>
-                <w:b/>
-                <w:bCs/>
-                <w:color w:val="000000" w:themeColor="text1"/>
-                <w:spacing w:val="-22"/>
-                <w:sz w:val="14"/>
-                <w:szCs w:val="14"/>
-              </w:rPr>
-            </w:pPr>
-          </w:p>
-        </w:tc>
-      </w:tr>
-      <w:tr>
-        <w:trPr>
-          <w:trHeight w:val="475"/>
-        </w:trPr>
-        <w:tc>
-          <w:tcPr>
-            <w:tcW w:w="829" w:type="dxa"/>
-            <w:tcBorders>
-              <w:top w:val="single" w:sz="2" w:space="0" w:color="000000"/>
-              <w:left w:val="single" w:sz="2" w:space="0" w:color="000000"/>
-              <w:bottom w:val="single" w:sz="2" w:space="0" w:color="000000"/>
-              <w:right w:val="single" w:sz="2" w:space="0" w:color="000000"/>
-            </w:tcBorders>
-            <w:tcMar>
-              <w:top w:w="28" w:type="dxa"/>
-              <w:left w:w="102" w:type="dxa"/>
-              <w:bottom w:w="28" w:type="dxa"/>
-              <w:right w:w="102" w:type="dxa"/>
-            </w:tcMar>
-            <w:vAlign w:val="center"/>
-            <w:hideMark/>
-          </w:tcPr>
-          <w:p>
-            <w:pPr>
-              <w:spacing w:after="0" w:line="384" w:lineRule="auto"/>
-              <w:jc w:val="center"/>
-              <w:textAlignment w:val="baseline"/>
-              <w:rPr>
-                <w:rFonts w:ascii="함초롬바탕" w:eastAsia="함초롬바탕" w:hAnsi="함초롬바탕" w:cs="함초롬바탕"/>
-                <w:b/>
-                <w:bCs/>
-                <w:color w:val="000000" w:themeColor="text1"/>
-                <w:sz w:val="14"/>
-                <w:szCs w:val="14"/>
-              </w:rPr>
-            </w:pPr>
-          </w:p>
-        </w:tc>
-        <w:tc>
-          <w:tcPr>
-            <w:tcW w:w="0" w:type="auto"/>
-            <w:tcBorders>
-              <w:top w:val="single" w:sz="2" w:space="0" w:color="000000"/>
-              <w:left w:val="single" w:sz="2" w:space="0" w:color="000000"/>
-              <w:bottom w:val="single" w:sz="2" w:space="0" w:color="000000"/>
-              <w:right w:val="single" w:sz="2" w:space="0" w:color="000000"/>
-            </w:tcBorders>
-            <w:tcMar>
-              <w:top w:w="28" w:type="dxa"/>
-              <w:left w:w="102" w:type="dxa"/>
-              <w:bottom w:w="28" w:type="dxa"/>
-              <w:right w:w="102" w:type="dxa"/>
-            </w:tcMar>
-            <w:vAlign w:val="center"/>
-            <w:hideMark/>
-          </w:tcPr>
-          <w:p>
-            <w:pPr>
-              <w:spacing w:after="0" w:line="384" w:lineRule="auto"/>
-              <w:jc w:val="center"/>
-              <w:textAlignment w:val="baseline"/>
-              <w:rPr>
-                <w:rFonts w:ascii="함초롬바탕" w:eastAsia="함초롬바탕" w:hAnsi="함초롬바탕" w:cs="함초롬바탕"/>
-                <w:b/>
-                <w:bCs/>
-                <w:color w:val="000000" w:themeColor="text1"/>
-                <w:sz w:val="14"/>
-                <w:szCs w:val="14"/>
-              </w:rPr>
-            </w:pPr>
-          </w:p>
-        </w:tc>
-        <w:tc>
-          <w:tcPr>
-            <w:tcW w:w="0" w:type="auto"/>
-            <w:tcBorders>
-              <w:top w:val="single" w:sz="2" w:space="0" w:color="000000"/>
-              <w:left w:val="single" w:sz="2" w:space="0" w:color="000000"/>
-              <w:bottom w:val="single" w:sz="2" w:space="0" w:color="000000"/>
-              <w:right w:val="single" w:sz="2" w:space="0" w:color="000000"/>
-            </w:tcBorders>
-            <w:tcMar>
-              <w:top w:w="28" w:type="dxa"/>
-              <w:left w:w="102" w:type="dxa"/>
-              <w:bottom w:w="28" w:type="dxa"/>
-              <w:right w:w="102" w:type="dxa"/>
-            </w:tcMar>
-            <w:vAlign w:val="center"/>
-            <w:hideMark/>
-          </w:tcPr>
-          <w:p>
-            <w:pPr>
-              <w:shd w:val="clear" w:color="auto" w:fill="CACACA"/>
-              <w:spacing w:after="0" w:line="384" w:lineRule="auto"/>
-              <w:jc w:val="center"/>
-              <w:textAlignment w:val="baseline"/>
-              <w:rPr>
-                <w:rFonts w:ascii="함초롬바탕" w:eastAsia="함초롬바탕" w:hAnsi="함초롬바탕" w:cs="함초롬바탕"/>
-                <w:b/>
-                <w:bCs/>
-                <w:color w:val="000000" w:themeColor="text1"/>
-                <w:sz w:val="14"/>
-                <w:szCs w:val="14"/>
-              </w:rPr>
-            </w:pPr>
-          </w:p>
-        </w:tc>
-        <w:tc>
-          <w:tcPr>
-            <w:tcW w:w="0" w:type="auto"/>
-            <w:tcBorders>
-              <w:top w:val="single" w:sz="2" w:space="0" w:color="000000"/>
-              <w:left w:val="single" w:sz="2" w:space="0" w:color="000000"/>
-              <w:bottom w:val="single" w:sz="2" w:space="0" w:color="000000"/>
-              <w:right w:val="single" w:sz="2" w:space="0" w:color="000000"/>
-            </w:tcBorders>
-            <w:tcMar>
-              <w:top w:w="28" w:type="dxa"/>
-              <w:left w:w="102" w:type="dxa"/>
-              <w:bottom w:w="28" w:type="dxa"/>
-              <w:right w:w="102" w:type="dxa"/>
-            </w:tcMar>
-            <w:vAlign w:val="center"/>
-            <w:hideMark/>
-          </w:tcPr>
-          <w:p>
-            <w:pPr>
-              <w:spacing w:after="0" w:line="384" w:lineRule="auto"/>
-              <w:jc w:val="center"/>
-              <w:textAlignment w:val="baseline"/>
-              <w:rPr>
-                <w:rFonts w:ascii="함초롬바탕" w:eastAsia="함초롬바탕" w:hAnsi="함초롬바탕" w:cs="함초롬바탕"/>
-                <w:b/>
-                <w:bCs/>
-                <w:color w:val="000000" w:themeColor="text1"/>
-                <w:sz w:val="14"/>
-                <w:szCs w:val="14"/>
-              </w:rPr>
-            </w:pPr>
-          </w:p>
-        </w:tc>
-        <w:tc>
-          <w:tcPr>
-            <w:tcW w:w="0" w:type="auto"/>
-            <w:tcBorders>
-              <w:top w:val="single" w:sz="2" w:space="0" w:color="000000"/>
-              <w:left w:val="single" w:sz="2" w:space="0" w:color="000000"/>
-              <w:bottom w:val="single" w:sz="2" w:space="0" w:color="000000"/>
-              <w:right w:val="single" w:sz="2" w:space="0" w:color="000000"/>
-            </w:tcBorders>
-            <w:tcMar>
-              <w:top w:w="28" w:type="dxa"/>
-              <w:left w:w="102" w:type="dxa"/>
-              <w:bottom w:w="28" w:type="dxa"/>
-              <w:right w:w="102" w:type="dxa"/>
-            </w:tcMar>
-            <w:vAlign w:val="center"/>
-            <w:hideMark/>
-          </w:tcPr>
-          <w:p>
-            <w:pPr>
-              <w:spacing w:after="0" w:line="360" w:lineRule="auto"/>
-              <w:ind w:left="780" w:hanging="780"/>
-              <w:jc w:val="center"/>
-              <w:textAlignment w:val="baseline"/>
-              <w:rPr>
-                <w:rFonts w:ascii="함초롬바탕" w:eastAsia="함초롬바탕" w:hAnsi="함초롬바탕" w:cs="함초롬바탕"/>
-                <w:b/>
-                <w:bCs/>
-                <w:color w:val="000000" w:themeColor="text1"/>
-                <w:spacing w:val="-16"/>
-                <w:sz w:val="14"/>
-                <w:szCs w:val="14"/>
-              </w:rPr>
-            </w:pPr>
-          </w:p>
-        </w:tc>
-        <w:tc>
-          <w:tcPr>
-            <w:tcW w:w="0" w:type="auto"/>
-            <w:tcBorders>
-              <w:top w:val="single" w:sz="2" w:space="0" w:color="000000"/>
-              <w:left w:val="single" w:sz="2" w:space="0" w:color="000000"/>
-              <w:bottom w:val="single" w:sz="2" w:space="0" w:color="000000"/>
-              <w:right w:val="single" w:sz="2" w:space="0" w:color="000000"/>
-            </w:tcBorders>
-            <w:tcMar>
-              <w:top w:w="28" w:type="dxa"/>
-              <w:left w:w="102" w:type="dxa"/>
-              <w:bottom w:w="28" w:type="dxa"/>
-              <w:right w:w="102" w:type="dxa"/>
-            </w:tcMar>
-            <w:vAlign w:val="center"/>
-            <w:hideMark/>
-          </w:tcPr>
-          <w:p>
-            <w:pPr>
-              <w:spacing w:after="0" w:line="360" w:lineRule="auto"/>
-              <w:ind w:left="780" w:hanging="780"/>
-              <w:jc w:val="center"/>
-              <w:textAlignment w:val="baseline"/>
-              <w:rPr>
-                <w:rFonts w:ascii="함초롬바탕" w:eastAsia="함초롬바탕" w:hAnsi="함초롬바탕" w:cs="함초롬바탕"/>
-                <w:b/>
-                <w:bCs/>
-                <w:color w:val="000000" w:themeColor="text1"/>
-                <w:spacing w:val="-16"/>
-                <w:sz w:val="14"/>
-                <w:szCs w:val="14"/>
-              </w:rPr>
-            </w:pPr>
-          </w:p>
-        </w:tc>
-        <w:tc>
-          <w:tcPr>
-            <w:tcW w:w="0" w:type="auto"/>
-            <w:tcBorders>
-              <w:top w:val="single" w:sz="2" w:space="0" w:color="000000"/>
-              <w:left w:val="single" w:sz="2" w:space="0" w:color="000000"/>
-              <w:bottom w:val="single" w:sz="2" w:space="0" w:color="000000"/>
-              <w:right w:val="single" w:sz="2" w:space="0" w:color="000000"/>
-            </w:tcBorders>
-            <w:tcMar>
-              <w:top w:w="28" w:type="dxa"/>
-              <w:left w:w="102" w:type="dxa"/>
-              <w:bottom w:w="28" w:type="dxa"/>
-              <w:right w:w="102" w:type="dxa"/>
-            </w:tcMar>
-            <w:vAlign w:val="center"/>
-            <w:hideMark/>
-          </w:tcPr>
-          <w:p>
-            <w:pPr>
-              <w:spacing w:after="0" w:line="360" w:lineRule="auto"/>
-              <w:ind w:left="780" w:hanging="780"/>
-              <w:jc w:val="center"/>
-              <w:textAlignment w:val="baseline"/>
-              <w:rPr>
-                <w:rFonts w:ascii="함초롬바탕" w:eastAsia="함초롬바탕" w:hAnsi="함초롬바탕" w:cs="함초롬바탕"/>
-                <w:b/>
-                <w:bCs/>
-                <w:color w:val="000000" w:themeColor="text1"/>
-                <w:spacing w:val="-16"/>
-                <w:sz w:val="14"/>
-                <w:szCs w:val="14"/>
-              </w:rPr>
-            </w:pPr>
-          </w:p>
-        </w:tc>
-        <w:tc>
-          <w:tcPr>
-            <w:tcW w:w="0" w:type="auto"/>
-            <w:tcBorders>
-              <w:top w:val="single" w:sz="2" w:space="0" w:color="000000"/>
-              <w:left w:val="single" w:sz="2" w:space="0" w:color="000000"/>
-              <w:bottom w:val="single" w:sz="2" w:space="0" w:color="000000"/>
-              <w:right w:val="single" w:sz="2" w:space="0" w:color="000000"/>
-            </w:tcBorders>
-            <w:tcMar>
-              <w:top w:w="28" w:type="dxa"/>
-              <w:left w:w="102" w:type="dxa"/>
-              <w:bottom w:w="28" w:type="dxa"/>
-              <w:right w:w="102" w:type="dxa"/>
-            </w:tcMar>
-            <w:vAlign w:val="center"/>
-            <w:hideMark/>
-          </w:tcPr>
-          <w:p>
-            <w:pPr>
-              <w:spacing w:after="0" w:line="360" w:lineRule="auto"/>
-              <w:ind w:left="780" w:hanging="780"/>
-              <w:jc w:val="center"/>
-              <w:textAlignment w:val="baseline"/>
-              <w:rPr>
-                <w:rFonts w:ascii="함초롬바탕" w:eastAsia="함초롬바탕" w:hAnsi="함초롬바탕" w:cs="함초롬바탕"/>
-                <w:b/>
-                <w:bCs/>
-                <w:color w:val="000000" w:themeColor="text1"/>
-                <w:spacing w:val="-16"/>
-                <w:sz w:val="14"/>
-                <w:szCs w:val="14"/>
-              </w:rPr>
-            </w:pPr>
-          </w:p>
-        </w:tc>
-        <w:tc>
-          <w:tcPr>
-            <w:tcW w:w="0" w:type="auto"/>
-            <w:tcBorders>
-              <w:top w:val="single" w:sz="2" w:space="0" w:color="000000"/>
-              <w:left w:val="single" w:sz="2" w:space="0" w:color="000000"/>
-              <w:bottom w:val="single" w:sz="2" w:space="0" w:color="000000"/>
-              <w:right w:val="single" w:sz="2" w:space="0" w:color="000000"/>
-            </w:tcBorders>
-            <w:tcMar>
-              <w:top w:w="28" w:type="dxa"/>
-              <w:left w:w="102" w:type="dxa"/>
-              <w:bottom w:w="28" w:type="dxa"/>
-              <w:right w:w="102" w:type="dxa"/>
-            </w:tcMar>
-            <w:vAlign w:val="center"/>
-            <w:hideMark/>
-          </w:tcPr>
-          <w:p>
-            <w:pPr>
-              <w:spacing w:after="0" w:line="360" w:lineRule="auto"/>
-              <w:ind w:left="780" w:hanging="780"/>
-              <w:jc w:val="center"/>
-              <w:textAlignment w:val="baseline"/>
-              <w:rPr>
-                <w:rFonts w:ascii="함초롬바탕" w:eastAsia="함초롬바탕" w:hAnsi="함초롬바탕" w:cs="함초롬바탕"/>
-                <w:b/>
-                <w:bCs/>
-                <w:color w:val="000000" w:themeColor="text1"/>
-                <w:spacing w:val="-16"/>
-                <w:sz w:val="14"/>
-                <w:szCs w:val="14"/>
-              </w:rPr>
-            </w:pPr>
-          </w:p>
-        </w:tc>
-        <w:tc>
-          <w:tcPr>
-            <w:tcW w:w="0" w:type="auto"/>
-            <w:tcBorders>
-              <w:top w:val="single" w:sz="2" w:space="0" w:color="000000"/>
-              <w:left w:val="single" w:sz="2" w:space="0" w:color="000000"/>
-              <w:bottom w:val="single" w:sz="2" w:space="0" w:color="000000"/>
-              <w:right w:val="single" w:sz="2" w:space="0" w:color="000000"/>
-            </w:tcBorders>
-            <w:tcMar>
-              <w:top w:w="28" w:type="dxa"/>
-              <w:left w:w="102" w:type="dxa"/>
-              <w:bottom w:w="28" w:type="dxa"/>
-              <w:right w:w="102" w:type="dxa"/>
-            </w:tcMar>
-            <w:vAlign w:val="center"/>
-            <w:hideMark/>
-          </w:tcPr>
-          <w:p>
-            <w:pPr>
-              <w:spacing w:after="0" w:line="360" w:lineRule="auto"/>
-              <w:ind w:left="780" w:hanging="780"/>
-              <w:jc w:val="center"/>
-              <w:textAlignment w:val="baseline"/>
-              <w:rPr>
-                <w:rFonts w:ascii="함초롬바탕" w:eastAsia="함초롬바탕" w:hAnsi="함초롬바탕" w:cs="함초롬바탕"/>
-                <w:b/>
-                <w:bCs/>
-                <w:color w:val="000000" w:themeColor="text1"/>
-                <w:spacing w:val="-16"/>
-                <w:sz w:val="14"/>
-                <w:szCs w:val="14"/>
-              </w:rPr>
-            </w:pPr>
-          </w:p>
-        </w:tc>
-        <w:tc>
-          <w:tcPr>
-            <w:tcW w:w="1132" w:type="dxa"/>
-            <w:tcBorders>
-              <w:top w:val="single" w:sz="2" w:space="0" w:color="000000"/>
-              <w:left w:val="single" w:sz="2" w:space="0" w:color="000000"/>
-              <w:bottom w:val="single" w:sz="2" w:space="0" w:color="000000"/>
-              <w:right w:val="single" w:sz="2" w:space="0" w:color="000000"/>
-            </w:tcBorders>
-            <w:tcMar>
-              <w:top w:w="28" w:type="dxa"/>
-              <w:left w:w="102" w:type="dxa"/>
-              <w:bottom w:w="28" w:type="dxa"/>
-              <w:right w:w="102" w:type="dxa"/>
-            </w:tcMar>
-            <w:vAlign w:val="center"/>
-            <w:hideMark/>
-          </w:tcPr>
-          <w:p>
-            <w:pPr>
-              <w:spacing w:after="0" w:line="360" w:lineRule="auto"/>
-              <w:ind w:left="780" w:hanging="780"/>
-              <w:jc w:val="center"/>
-              <w:textAlignment w:val="baseline"/>
-              <w:rPr>
-                <w:rFonts w:ascii="함초롬바탕" w:eastAsia="함초롬바탕" w:hAnsi="함초롬바탕" w:cs="함초롬바탕"/>
-                <w:b/>
-                <w:bCs/>
-                <w:color w:val="000000" w:themeColor="text1"/>
-                <w:spacing w:val="-22"/>
-                <w:sz w:val="14"/>
-                <w:szCs w:val="14"/>
-              </w:rPr>
-            </w:pPr>
-          </w:p>
-        </w:tc>
-      </w:tr>
-      <w:tr>
-        <w:trPr>
-          <w:trHeight w:val="475"/>
-        </w:trPr>
-        <w:tc>
-          <w:tcPr>
-            <w:tcW w:w="9773" w:type="dxa"/>
+            <w:tcW w:w="1021" w:type="dxa"/>
             <w:gridSpan w:val="11"/>
             <w:tcBorders>
               <w:top w:val="single" w:sz="2" w:space="0" w:color="000000"/>
@@ -6945,7 +5013,6 @@
           <w:sz w:val="18"/>
           <w:szCs w:val="18"/>
         </w:rPr>
-        <w:lastRenderedPageBreak/>
         <w:t xml:space="preserve">2) Mark with "V" if the chemical is classified under the corresponding category defined as hazardous substances </w:t>
       </w:r>
       <w:r>

</xml_diff>